<commit_message>
Small fix (e.g. replacing ' by ")
</commit_message>
<xml_diff>
--- a/python/Inspect_EDF/README.docx
+++ b/python/Inspect_EDF/README.docx
@@ -9,6 +9,7 @@
           <w:lang w:val="en-US"/>
         </w:rPr>
       </w:pPr>
+      <w:proofErr w:type="spellStart"/>
       <w:r>
         <w:rPr>
           <w:lang w:val="en-US"/>
@@ -19,7 +20,14 @@
         <w:rPr>
           <w:lang w:val="en-US"/>
         </w:rPr>
-        <w:t xml:space="preserve">_EDF - </w:t>
+        <w:t>_EDF</w:t>
+      </w:r>
+      <w:proofErr w:type="spellEnd"/>
+      <w:r>
+        <w:rPr>
+          <w:lang w:val="en-US"/>
+        </w:rPr>
+        <w:t xml:space="preserve"> - </w:t>
       </w:r>
       <w:r>
         <w:rPr>
@@ -222,7 +230,21 @@
         <w:rPr>
           <w:lang w:val="en-US"/>
         </w:rPr>
-        <w:t xml:space="preserve"> (jupyter notebook</w:t>
+        <w:t xml:space="preserve"> (</w:t>
+      </w:r>
+      <w:proofErr w:type="spellStart"/>
+      <w:r>
+        <w:rPr>
+          <w:lang w:val="en-US"/>
+        </w:rPr>
+        <w:t>jupyter</w:t>
+      </w:r>
+      <w:proofErr w:type="spellEnd"/>
+      <w:r>
+        <w:rPr>
+          <w:lang w:val="en-US"/>
+        </w:rPr>
+        <w:t xml:space="preserve"> notebook</w:t>
       </w:r>
       <w:r>
         <w:rPr>
@@ -431,7 +453,21 @@
         <w:rPr>
           <w:lang w:val="en-US"/>
         </w:rPr>
-        <w:t xml:space="preserve"> (via miniforge) and install the necessary packages to run scripts and notebooks</w:t>
+        <w:t xml:space="preserve"> (via </w:t>
+      </w:r>
+      <w:proofErr w:type="spellStart"/>
+      <w:r>
+        <w:rPr>
+          <w:lang w:val="en-US"/>
+        </w:rPr>
+        <w:t>miniforge</w:t>
+      </w:r>
+      <w:proofErr w:type="spellEnd"/>
+      <w:r>
+        <w:rPr>
+          <w:lang w:val="en-US"/>
+        </w:rPr>
+        <w:t>) and install the necessary packages to run scripts and notebooks</w:t>
       </w:r>
     </w:p>
     <w:p>
@@ -448,8 +484,8 @@
       </w:pPr>
       <w:r>
         <w:rPr>
-          <w:b w:val="1"/>
-          <w:bCs w:val="1"/>
+          <w:b/>
+          <w:bCs/>
           <w:lang w:val="en-US"/>
         </w:rPr>
         <w:t>2_create_EEG_montage_Profusion</w:t>
@@ -470,19 +506,7 @@
         <w:rPr>
           <w:lang w:val="en-US"/>
         </w:rPr>
-        <w:t xml:space="preserve">create montage in the Profusion software that will </w:t>
-      </w:r>
-      <w:r>
-        <w:rPr>
-          <w:lang w:val="en-US"/>
-        </w:rPr>
-        <w:t>greatly facilitate</w:t>
-      </w:r>
-      <w:r>
-        <w:rPr>
-          <w:lang w:val="en-US"/>
-        </w:rPr>
-        <w:t xml:space="preserve"> the export of</w:t>
+        <w:t>create montage in the Profusion software that will greatly facilitate the export of</w:t>
       </w:r>
       <w:r>
         <w:rPr>
@@ -553,7 +577,21 @@
         <w:rPr>
           <w:lang w:val="en-US"/>
         </w:rPr>
-        <w:t xml:space="preserve"> with a pre-defined montage (from tuto 2)</w:t>
+        <w:t xml:space="preserve"> with a pre-defined montage (from </w:t>
+      </w:r>
+      <w:proofErr w:type="spellStart"/>
+      <w:r>
+        <w:rPr>
+          <w:lang w:val="en-US"/>
+        </w:rPr>
+        <w:t>tuto</w:t>
+      </w:r>
+      <w:proofErr w:type="spellEnd"/>
+      <w:r>
+        <w:rPr>
+          <w:lang w:val="en-US"/>
+        </w:rPr>
+        <w:t xml:space="preserve"> 2)</w:t>
       </w:r>
     </w:p>
     <w:p>
@@ -605,124 +643,7 @@
         <w:rPr>
           <w:lang w:val="en-US"/>
         </w:rPr>
-        <w:t>Jupyter notebooks:</w:t>
-      </w:r>
-    </w:p>
-    <w:p>
-      <w:pPr>
-        <w:pStyle w:val="Paragraphedeliste"/>
-        <w:jc w:val="both"/>
-        <w:rPr>
-          <w:lang w:val="en-US"/>
-        </w:rPr>
-      </w:pPr>
-      <w:r>
-        <w:rPr>
-          <w:lang w:val="en-US"/>
-        </w:rPr>
-        <w:t>Jupyter notebooks</w:t>
-      </w:r>
-      <w:r>
-        <w:rPr>
-          <w:lang w:val="en-US"/>
-        </w:rPr>
-        <w:t xml:space="preserve"> are </w:t>
-      </w:r>
-      <w:r>
-        <w:rPr>
-          <w:lang w:val="en-US"/>
-        </w:rPr>
-        <w:t xml:space="preserve">tools </w:t>
-      </w:r>
-      <w:r>
-        <w:rPr>
-          <w:lang w:val="en-US"/>
-        </w:rPr>
-        <w:t>in between</w:t>
-      </w:r>
-      <w:r>
-        <w:rPr>
-          <w:lang w:val="en-US"/>
-        </w:rPr>
-        <w:t xml:space="preserve"> tutorials </w:t>
-      </w:r>
-      <w:r>
-        <w:rPr>
-          <w:lang w:val="en-US"/>
-        </w:rPr>
-        <w:t xml:space="preserve">and </w:t>
-      </w:r>
-      <w:r>
-        <w:rPr>
-          <w:lang w:val="en-US"/>
-        </w:rPr>
-        <w:t xml:space="preserve">scripts that </w:t>
-      </w:r>
-      <w:r>
-        <w:rPr>
-          <w:lang w:val="en-US"/>
-        </w:rPr>
-        <w:t>allow</w:t>
-      </w:r>
-      <w:r>
-        <w:rPr>
-          <w:lang w:val="en-US"/>
-        </w:rPr>
-        <w:t xml:space="preserve"> users to </w:t>
-      </w:r>
-      <w:r>
-        <w:rPr>
-          <w:lang w:val="en-US"/>
-        </w:rPr>
-        <w:t>interact with code</w:t>
-      </w:r>
-      <w:r>
-        <w:rPr>
-          <w:lang w:val="en-US"/>
-        </w:rPr>
-        <w:t xml:space="preserve"> and the ou</w:t>
-      </w:r>
-      <w:r>
-        <w:rPr>
-          <w:lang w:val="en-US"/>
-        </w:rPr>
-        <w:t>t</w:t>
-      </w:r>
-      <w:r>
-        <w:rPr>
-          <w:lang w:val="en-US"/>
-        </w:rPr>
-        <w:t>put</w:t>
-      </w:r>
-      <w:r>
-        <w:rPr>
-          <w:lang w:val="en-US"/>
-        </w:rPr>
-        <w:t xml:space="preserve">. They are used </w:t>
-      </w:r>
-      <w:r>
-        <w:rPr>
-          <w:lang w:val="en-US"/>
-        </w:rPr>
-        <w:t xml:space="preserve">here as step-by-step </w:t>
-      </w:r>
-      <w:r>
-        <w:rPr>
-          <w:lang w:val="en-US"/>
-        </w:rPr>
-        <w:t>tutorials</w:t>
-      </w:r>
-      <w:r>
-        <w:rPr>
-          <w:lang w:val="en-US"/>
-        </w:rPr>
-        <w:t xml:space="preserve"> to understand the specificities of the EDF format and </w:t>
-      </w:r>
-      <w:r>
-        <w:rPr>
-          <w:lang w:val="en-US"/>
-        </w:rPr>
-        <w:t>the parameters we need to be careful with (when exporting the EEG data)</w:t>
+        <w:t>Tools:</w:t>
       </w:r>
     </w:p>
     <w:p>
@@ -737,6 +658,159 @@
           <w:lang w:val="en-US"/>
         </w:rPr>
       </w:pPr>
+      <w:proofErr w:type="spellStart"/>
+      <w:r>
+        <w:rPr>
+          <w:lang w:val="en-US"/>
+        </w:rPr>
+        <w:t>Jupyter</w:t>
+      </w:r>
+      <w:proofErr w:type="spellEnd"/>
+      <w:r>
+        <w:rPr>
+          <w:lang w:val="en-US"/>
+        </w:rPr>
+        <w:t xml:space="preserve"> notebooks:</w:t>
+      </w:r>
+    </w:p>
+    <w:p>
+      <w:pPr>
+        <w:pStyle w:val="Paragraphedeliste"/>
+        <w:ind w:firstLine="360"/>
+        <w:jc w:val="both"/>
+        <w:rPr>
+          <w:lang w:val="en-US"/>
+        </w:rPr>
+      </w:pPr>
+      <w:proofErr w:type="spellStart"/>
+      <w:r>
+        <w:rPr>
+          <w:lang w:val="en-US"/>
+        </w:rPr>
+        <w:t>Jupyter</w:t>
+      </w:r>
+      <w:proofErr w:type="spellEnd"/>
+      <w:r>
+        <w:rPr>
+          <w:lang w:val="en-US"/>
+        </w:rPr>
+        <w:t xml:space="preserve"> notebooks</w:t>
+      </w:r>
+      <w:r>
+        <w:rPr>
+          <w:lang w:val="en-US"/>
+        </w:rPr>
+        <w:t xml:space="preserve"> are </w:t>
+      </w:r>
+      <w:r>
+        <w:rPr>
+          <w:lang w:val="en-US"/>
+        </w:rPr>
+        <w:t xml:space="preserve">tools </w:t>
+      </w:r>
+      <w:r>
+        <w:rPr>
+          <w:lang w:val="en-US"/>
+        </w:rPr>
+        <w:t>in between</w:t>
+      </w:r>
+      <w:r>
+        <w:rPr>
+          <w:lang w:val="en-US"/>
+        </w:rPr>
+        <w:t xml:space="preserve"> tutorials </w:t>
+      </w:r>
+      <w:r>
+        <w:rPr>
+          <w:lang w:val="en-US"/>
+        </w:rPr>
+        <w:t xml:space="preserve">and </w:t>
+      </w:r>
+      <w:r>
+        <w:rPr>
+          <w:lang w:val="en-US"/>
+        </w:rPr>
+        <w:t xml:space="preserve">scripts that </w:t>
+      </w:r>
+      <w:r>
+        <w:rPr>
+          <w:lang w:val="en-US"/>
+        </w:rPr>
+        <w:t>allow</w:t>
+      </w:r>
+      <w:r>
+        <w:rPr>
+          <w:lang w:val="en-US"/>
+        </w:rPr>
+        <w:t xml:space="preserve"> users to </w:t>
+      </w:r>
+      <w:r>
+        <w:rPr>
+          <w:lang w:val="en-US"/>
+        </w:rPr>
+        <w:t>interact with code</w:t>
+      </w:r>
+      <w:r>
+        <w:rPr>
+          <w:lang w:val="en-US"/>
+        </w:rPr>
+        <w:t xml:space="preserve"> and the ou</w:t>
+      </w:r>
+      <w:r>
+        <w:rPr>
+          <w:lang w:val="en-US"/>
+        </w:rPr>
+        <w:t>t</w:t>
+      </w:r>
+      <w:r>
+        <w:rPr>
+          <w:lang w:val="en-US"/>
+        </w:rPr>
+        <w:t>put</w:t>
+      </w:r>
+      <w:r>
+        <w:rPr>
+          <w:lang w:val="en-US"/>
+        </w:rPr>
+        <w:t xml:space="preserve">. They are used </w:t>
+      </w:r>
+      <w:r>
+        <w:rPr>
+          <w:lang w:val="en-US"/>
+        </w:rPr>
+        <w:t xml:space="preserve">here as step-by-step </w:t>
+      </w:r>
+      <w:r>
+        <w:rPr>
+          <w:lang w:val="en-US"/>
+        </w:rPr>
+        <w:t>tutorials</w:t>
+      </w:r>
+      <w:r>
+        <w:rPr>
+          <w:lang w:val="en-US"/>
+        </w:rPr>
+        <w:t xml:space="preserve"> to understand the specificities of the EDF format and </w:t>
+      </w:r>
+      <w:r>
+        <w:rPr>
+          <w:lang w:val="en-US"/>
+        </w:rPr>
+        <w:t>the parameters we need to be careful with (when exporting the EEG data)</w:t>
+      </w:r>
+    </w:p>
+    <w:p>
+      <w:pPr>
+        <w:pStyle w:val="Paragraphedeliste"/>
+        <w:numPr>
+          <w:ilvl w:val="2"/>
+          <w:numId w:val="11"/>
+        </w:numPr>
+        <w:jc w:val="both"/>
+        <w:rPr>
+          <w:lang w:val="en-US"/>
+        </w:rPr>
+      </w:pPr>
       <w:r>
         <w:rPr>
           <w:b/>
@@ -842,6 +916,67 @@
           <w:lang w:val="en-US"/>
         </w:rPr>
         <w:t>checking the code</w:t>
+      </w:r>
+      <w:r>
+        <w:rPr>
+          <w:lang w:val="en-US"/>
+        </w:rPr>
+        <w:t>.</w:t>
+      </w:r>
+    </w:p>
+    <w:p>
+      <w:pPr>
+        <w:pStyle w:val="Paragraphedeliste"/>
+        <w:numPr>
+          <w:ilvl w:val="2"/>
+          <w:numId w:val="11"/>
+        </w:numPr>
+        <w:jc w:val="both"/>
+        <w:rPr>
+          <w:lang w:val="en-US"/>
+        </w:rPr>
+      </w:pPr>
+      <w:proofErr w:type="spellStart"/>
+      <w:r>
+        <w:rPr>
+          <w:b/>
+          <w:bCs/>
+          <w:lang w:val="en-US"/>
+        </w:rPr>
+        <w:t>Inspect_edf_voila</w:t>
+      </w:r>
+      <w:r>
+        <w:rPr>
+          <w:b/>
+          <w:bCs/>
+          <w:lang w:val="en-US"/>
+        </w:rPr>
+        <w:t>.ipynb</w:t>
+      </w:r>
+      <w:proofErr w:type="spellEnd"/>
+      <w:r>
+        <w:rPr>
+          <w:lang w:val="en-US"/>
+        </w:rPr>
+        <w:t xml:space="preserve">: </w:t>
+      </w:r>
+      <w:r>
+        <w:rPr>
+          <w:lang w:val="en-US"/>
+        </w:rPr>
+        <w:t>Same cont</w:t>
+      </w:r>
+      <w:r>
+        <w:rPr>
+          <w:lang w:val="en-US"/>
+        </w:rPr>
+        <w:t xml:space="preserve">ent as inspect_edf_v1 but the code is hidden </w:t>
+      </w:r>
+      <w:r>
+        <w:rPr>
+          <w:lang w:val="en-US"/>
+        </w:rPr>
+        <w:t>(so the notebook is more readable in itself). It is recommended for the first use if the user is not interested in the code</w:t>
       </w:r>
       <w:r>
         <w:rPr>
@@ -864,56 +999,87 @@
       </w:pPr>
       <w:r>
         <w:rPr>
-          <w:b/>
-          <w:bCs/>
-          <w:lang w:val="en-US"/>
-        </w:rPr>
-        <w:t>Inspect_edf_voila</w:t>
-      </w:r>
-      <w:r>
-        <w:rPr>
-          <w:b/>
-          <w:bCs/>
-          <w:lang w:val="en-US"/>
-        </w:rPr>
-        <w:t>.ipynb</w:t>
-      </w:r>
-      <w:r>
-        <w:rPr>
-          <w:lang w:val="en-US"/>
-        </w:rPr>
-        <w:t xml:space="preserve">: </w:t>
-      </w:r>
-      <w:r>
-        <w:rPr>
-          <w:lang w:val="en-US"/>
-        </w:rPr>
-        <w:t>Same cont</w:t>
-      </w:r>
-      <w:r>
-        <w:rPr>
-          <w:lang w:val="en-US"/>
-        </w:rPr>
-        <w:t xml:space="preserve">ent as inspect_edf_v1 but the code is hidden </w:t>
-      </w:r>
-      <w:r>
-        <w:rPr>
-          <w:lang w:val="en-US"/>
-        </w:rPr>
-        <w:t>(so the notebook is more readable in itself). It is recommended for the first use if the user is not interested in the code</w:t>
-      </w:r>
-      <w:r>
-        <w:rPr>
-          <w:lang w:val="en-US"/>
-        </w:rPr>
-        <w:t>.</w:t>
+          <w:lang w:val="en-US"/>
+        </w:rPr>
+        <w:lastRenderedPageBreak/>
+        <w:t>Python</w:t>
+      </w:r>
+      <w:r>
+        <w:rPr>
+          <w:lang w:val="en-US"/>
+        </w:rPr>
+        <w:t xml:space="preserve"> scripts:</w:t>
       </w:r>
     </w:p>
     <w:p>
       <w:pPr>
         <w:pStyle w:val="Paragraphedeliste"/>
+        <w:ind w:firstLine="360"/>
+        <w:jc w:val="both"/>
+        <w:rPr>
+          <w:lang w:val="en-US"/>
+        </w:rPr>
+      </w:pPr>
+      <w:r>
+        <w:rPr>
+          <w:lang w:val="en-US"/>
+        </w:rPr>
+        <w:t xml:space="preserve">Python scripts </w:t>
+      </w:r>
+      <w:r>
+        <w:rPr>
+          <w:lang w:val="en-US"/>
+        </w:rPr>
+        <w:t xml:space="preserve">are tools </w:t>
+      </w:r>
+      <w:r>
+        <w:rPr>
+          <w:lang w:val="en-US"/>
+        </w:rPr>
+        <w:t>that the user will just have to run in order to get reports</w:t>
+      </w:r>
+      <w:r>
+        <w:rPr>
+          <w:lang w:val="en-US"/>
+        </w:rPr>
+        <w:t xml:space="preserve"> and summary tables. The</w:t>
+      </w:r>
+      <w:r>
+        <w:rPr>
+          <w:lang w:val="en-US"/>
+        </w:rPr>
+        <w:t>y</w:t>
+      </w:r>
+      <w:r>
+        <w:rPr>
+          <w:lang w:val="en-US"/>
+        </w:rPr>
+        <w:t xml:space="preserve"> are recommended for users just interested in </w:t>
+      </w:r>
+      <w:r>
+        <w:rPr>
+          <w:lang w:val="en-US"/>
+        </w:rPr>
+        <w:t xml:space="preserve">inspecting quickly their database (and that already </w:t>
+      </w:r>
+      <w:r>
+        <w:rPr>
+          <w:lang w:val="en-US"/>
+        </w:rPr>
+        <w:t xml:space="preserve">understand </w:t>
+      </w:r>
+      <w:r>
+        <w:rPr>
+          <w:lang w:val="en-US"/>
+        </w:rPr>
+        <w:t>them).</w:t>
+      </w:r>
+    </w:p>
+    <w:p>
+      <w:pPr>
+        <w:pStyle w:val="Paragraphedeliste"/>
         <w:numPr>
-          <w:ilvl w:val="0"/>
+          <w:ilvl w:val="2"/>
           <w:numId w:val="11"/>
         </w:numPr>
         <w:jc w:val="both"/>
@@ -923,86 +1089,104 @@
       </w:pPr>
       <w:r>
         <w:rPr>
-          <w:lang w:val="en-US"/>
-        </w:rPr>
-        <w:t>Python</w:t>
-      </w:r>
-      <w:r>
-        <w:rPr>
-          <w:lang w:val="en-US"/>
-        </w:rPr>
-        <w:t xml:space="preserve"> scripts:</w:t>
+          <w:b/>
+          <w:bCs/>
+          <w:lang w:val="en-US"/>
+        </w:rPr>
+        <w:t>Insp</w:t>
+      </w:r>
+      <w:r>
+        <w:rPr>
+          <w:b/>
+          <w:bCs/>
+          <w:lang w:val="en-US"/>
+        </w:rPr>
+        <w:t>e</w:t>
+      </w:r>
+      <w:r>
+        <w:rPr>
+          <w:b/>
+          <w:bCs/>
+          <w:lang w:val="en-US"/>
+        </w:rPr>
+        <w:t>ct_edf_</w:t>
+      </w:r>
+      <w:r>
+        <w:rPr>
+          <w:b/>
+          <w:bCs/>
+          <w:lang w:val="en-US"/>
+        </w:rPr>
+        <w:t>perdataset.py</w:t>
+      </w:r>
+      <w:r>
+        <w:rPr>
+          <w:lang w:val="en-US"/>
+        </w:rPr>
+        <w:t xml:space="preserve">: </w:t>
+      </w:r>
+      <w:r>
+        <w:rPr>
+          <w:lang w:val="en-US"/>
+        </w:rPr>
+        <w:t xml:space="preserve">Generates a report </w:t>
+      </w:r>
+      <w:r>
+        <w:rPr>
+          <w:lang w:val="en-US"/>
+        </w:rPr>
+        <w:t xml:space="preserve">for the whole database, pointing to files that may have </w:t>
+      </w:r>
+      <w:r>
+        <w:rPr>
+          <w:lang w:val="en-US"/>
+        </w:rPr>
+        <w:t>a problem in their parameters. It additionally creates</w:t>
+      </w:r>
+      <w:r>
+        <w:rPr>
+          <w:lang w:val="en-US"/>
+        </w:rPr>
+        <w:t xml:space="preserve"> </w:t>
+      </w:r>
+      <w:r>
+        <w:rPr>
+          <w:lang w:val="en-US"/>
+        </w:rPr>
+        <w:t>summary tables</w:t>
+      </w:r>
+      <w:r>
+        <w:rPr>
+          <w:lang w:val="en-US"/>
+        </w:rPr>
+        <w:t xml:space="preserve"> (.</w:t>
+      </w:r>
+      <w:proofErr w:type="spellStart"/>
+      <w:r>
+        <w:rPr>
+          <w:lang w:val="en-US"/>
+        </w:rPr>
+        <w:t>tsv</w:t>
+      </w:r>
+      <w:proofErr w:type="spellEnd"/>
+      <w:r>
+        <w:rPr>
+          <w:lang w:val="en-US"/>
+        </w:rPr>
+        <w:t xml:space="preserve">) </w:t>
+      </w:r>
+      <w:r>
+        <w:rPr>
+          <w:lang w:val="en-US"/>
+        </w:rPr>
+        <w:t>to inspect the content of files if needed.</w:t>
       </w:r>
     </w:p>
     <w:p>
       <w:pPr>
         <w:pStyle w:val="Paragraphedeliste"/>
-        <w:jc w:val="both"/>
-        <w:rPr>
-          <w:lang w:val="en-US"/>
-        </w:rPr>
-      </w:pPr>
-      <w:r>
-        <w:rPr>
-          <w:lang w:val="en-US"/>
-        </w:rPr>
-        <w:lastRenderedPageBreak/>
-        <w:t xml:space="preserve">Python scripts </w:t>
-      </w:r>
-      <w:r>
-        <w:rPr>
-          <w:lang w:val="en-US"/>
-        </w:rPr>
-        <w:t xml:space="preserve">are tools </w:t>
-      </w:r>
-      <w:r>
-        <w:rPr>
-          <w:lang w:val="en-US"/>
-        </w:rPr>
-        <w:t>that the user will just have to run in order to get reports</w:t>
-      </w:r>
-      <w:r>
-        <w:rPr>
-          <w:lang w:val="en-US"/>
-        </w:rPr>
-        <w:t xml:space="preserve"> and summary tables. The</w:t>
-      </w:r>
-      <w:r>
-        <w:rPr>
-          <w:lang w:val="en-US"/>
-        </w:rPr>
-        <w:t>y</w:t>
-      </w:r>
-      <w:r>
-        <w:rPr>
-          <w:lang w:val="en-US"/>
-        </w:rPr>
-        <w:t xml:space="preserve"> are recommended for users just interested in </w:t>
-      </w:r>
-      <w:r>
-        <w:rPr>
-          <w:lang w:val="en-US"/>
-        </w:rPr>
-        <w:t xml:space="preserve">inspecting quickly their database (and that already </w:t>
-      </w:r>
-      <w:r>
-        <w:rPr>
-          <w:lang w:val="en-US"/>
-        </w:rPr>
-        <w:t xml:space="preserve">understand </w:t>
-      </w:r>
-      <w:r>
-        <w:rPr>
-          <w:lang w:val="en-US"/>
-        </w:rPr>
-        <w:t>them).</w:t>
-      </w:r>
-    </w:p>
-    <w:p>
-      <w:pPr>
-        <w:pStyle w:val="Paragraphedeliste"/>
         <w:numPr>
-          <w:ilvl w:val="1"/>
+          <w:ilvl w:val="2"/>
           <w:numId w:val="11"/>
         </w:numPr>
         <w:jc w:val="both"/>
@@ -1016,7 +1200,7 @@
           <w:bCs/>
           <w:lang w:val="en-US"/>
         </w:rPr>
-        <w:t>Insp</w:t>
+        <w:t>Inspect_edf_perparticipant</w:t>
       </w:r>
       <w:r>
         <w:rPr>
@@ -1024,125 +1208,32 @@
           <w:bCs/>
           <w:lang w:val="en-US"/>
         </w:rPr>
-        <w:t>e</w:t>
-      </w:r>
-      <w:r>
-        <w:rPr>
-          <w:b/>
-          <w:bCs/>
-          <w:lang w:val="en-US"/>
-        </w:rPr>
-        <w:t>ct_edf_</w:t>
-      </w:r>
-      <w:r>
-        <w:rPr>
-          <w:b/>
-          <w:bCs/>
-          <w:lang w:val="en-US"/>
-        </w:rPr>
-        <w:t>perdataset.py</w:t>
-      </w:r>
-      <w:r>
-        <w:rPr>
-          <w:lang w:val="en-US"/>
-        </w:rPr>
-        <w:t xml:space="preserve">: </w:t>
-      </w:r>
-      <w:r>
-        <w:rPr>
-          <w:lang w:val="en-US"/>
-        </w:rPr>
-        <w:t xml:space="preserve">Generates a report </w:t>
-      </w:r>
-      <w:r>
-        <w:rPr>
-          <w:lang w:val="en-US"/>
-        </w:rPr>
-        <w:t xml:space="preserve">for the whole database, pointing to files that may have </w:t>
-      </w:r>
-      <w:r>
-        <w:rPr>
-          <w:lang w:val="en-US"/>
-        </w:rPr>
-        <w:t>a problem in their parameters. It additionally creates</w:t>
-      </w:r>
-      <w:r>
-        <w:rPr>
-          <w:lang w:val="en-US"/>
-        </w:rPr>
-        <w:t xml:space="preserve"> </w:t>
-      </w:r>
-      <w:r>
-        <w:rPr>
-          <w:lang w:val="en-US"/>
-        </w:rPr>
-        <w:t>summary tables</w:t>
-      </w:r>
-      <w:r>
-        <w:rPr>
-          <w:lang w:val="en-US"/>
-        </w:rPr>
-        <w:t xml:space="preserve"> (.tsv) </w:t>
-      </w:r>
-      <w:r>
-        <w:rPr>
-          <w:lang w:val="en-US"/>
-        </w:rPr>
-        <w:t>to inspect the content of files if needed.</w:t>
+        <w:t>.py</w:t>
+      </w:r>
+      <w:r>
+        <w:rPr>
+          <w:lang w:val="en-US"/>
+        </w:rPr>
+        <w:t xml:space="preserve">: The report is generated at the participant level, so that </w:t>
+      </w:r>
+      <w:r>
+        <w:rPr>
+          <w:lang w:val="en-US"/>
+        </w:rPr>
+        <w:t xml:space="preserve">each participant can be inspected separately (more readable than a table, but </w:t>
+      </w:r>
+      <w:r>
+        <w:rPr>
+          <w:lang w:val="en-US"/>
+        </w:rPr>
+        <w:t>longer to go through.</w:t>
       </w:r>
     </w:p>
     <w:p>
       <w:pPr>
         <w:pStyle w:val="Paragraphedeliste"/>
         <w:numPr>
-          <w:ilvl w:val="1"/>
-          <w:numId w:val="11"/>
-        </w:numPr>
-        <w:jc w:val="both"/>
-        <w:rPr>
-          <w:lang w:val="en-US"/>
-        </w:rPr>
-      </w:pPr>
-      <w:r>
-        <w:rPr>
-          <w:b/>
-          <w:bCs/>
-          <w:lang w:val="en-US"/>
-        </w:rPr>
-        <w:t>Inspect_edf_perparticipant</w:t>
-      </w:r>
-      <w:r>
-        <w:rPr>
-          <w:b/>
-          <w:bCs/>
-          <w:lang w:val="en-US"/>
-        </w:rPr>
-        <w:t>.py</w:t>
-      </w:r>
-      <w:r>
-        <w:rPr>
-          <w:lang w:val="en-US"/>
-        </w:rPr>
-        <w:t xml:space="preserve">: The report is generated at the participant level, so that </w:t>
-      </w:r>
-      <w:r>
-        <w:rPr>
-          <w:lang w:val="en-US"/>
-        </w:rPr>
-        <w:t xml:space="preserve">each participant can be inspected separately (more readable than a table, but </w:t>
-      </w:r>
-      <w:r>
-        <w:rPr>
-          <w:lang w:val="en-US"/>
-        </w:rPr>
-        <w:t>longer to go through.</w:t>
-      </w:r>
-    </w:p>
-    <w:p>
-      <w:pPr>
-        <w:pStyle w:val="Paragraphedeliste"/>
-        <w:numPr>
-          <w:ilvl w:val="1"/>
+          <w:ilvl w:val="2"/>
           <w:numId w:val="11"/>
         </w:numPr>
         <w:jc w:val="both"/>
@@ -1349,7 +1440,14 @@
         <w:rPr>
           <w:lang w:val="en-US"/>
         </w:rPr>
-        <w:t>with the .y</w:t>
+        <w:t>with the .</w:t>
+      </w:r>
+      <w:proofErr w:type="spellStart"/>
+      <w:r>
+        <w:rPr>
+          <w:lang w:val="en-US"/>
+        </w:rPr>
+        <w:t>y</w:t>
       </w:r>
       <w:r>
         <w:rPr>
@@ -1361,7 +1459,14 @@
         <w:rPr>
           <w:lang w:val="en-US"/>
         </w:rPr>
-        <w:t>ml in order to install the packages</w:t>
+        <w:t>ml</w:t>
+      </w:r>
+      <w:proofErr w:type="spellEnd"/>
+      <w:r>
+        <w:rPr>
+          <w:lang w:val="en-US"/>
+        </w:rPr>
+        <w:t xml:space="preserve"> in order to install the packages</w:t>
       </w:r>
       <w:r>
         <w:rPr>
@@ -1462,7 +1567,21 @@
         <w:rPr>
           <w:lang w:val="en-US"/>
         </w:rPr>
-        <w:t xml:space="preserve">Inspect your first database with inspect_edf_voila.ipynb to understand </w:t>
+        <w:t xml:space="preserve">Inspect your first database with </w:t>
+      </w:r>
+      <w:proofErr w:type="spellStart"/>
+      <w:r>
+        <w:rPr>
+          <w:lang w:val="en-US"/>
+        </w:rPr>
+        <w:t>inspect_edf_voila.ipynb</w:t>
+      </w:r>
+      <w:proofErr w:type="spellEnd"/>
+      <w:r>
+        <w:rPr>
+          <w:lang w:val="en-US"/>
+        </w:rPr>
+        <w:t xml:space="preserve"> to understand </w:t>
       </w:r>
       <w:r>
         <w:rPr>
@@ -1582,14 +1701,30 @@
         <w:rPr>
           <w:lang w:val="en-US"/>
         </w:rPr>
-        <w:t xml:space="preserve">run `conda activate </w:t>
-      </w:r>
+        <w:t>run `</w:t>
+      </w:r>
+      <w:proofErr w:type="spellStart"/>
+      <w:r>
+        <w:rPr>
+          <w:lang w:val="en-US"/>
+        </w:rPr>
+        <w:t>conda</w:t>
+      </w:r>
+      <w:proofErr w:type="spellEnd"/>
+      <w:r>
+        <w:rPr>
+          <w:lang w:val="en-US"/>
+        </w:rPr>
+        <w:t xml:space="preserve"> activate </w:t>
+      </w:r>
+      <w:proofErr w:type="spellStart"/>
       <w:r>
         <w:rPr>
           <w:lang w:val="en-US"/>
         </w:rPr>
         <w:t>inspect_edf</w:t>
       </w:r>
+      <w:proofErr w:type="spellEnd"/>
       <w:r>
         <w:rPr>
           <w:lang w:val="en-US"/>
@@ -1638,12 +1773,14 @@
         </w:rPr>
         <w:t xml:space="preserve">(run `cd </w:t>
       </w:r>
+      <w:proofErr w:type="spellStart"/>
       <w:r>
         <w:rPr>
           <w:lang w:val="en-US"/>
         </w:rPr>
         <w:t>my_folder_path</w:t>
       </w:r>
+      <w:proofErr w:type="spellEnd"/>
       <w:r>
         <w:rPr>
           <w:lang w:val="en-US"/>
@@ -1708,7 +1845,21 @@
         <w:rPr>
           <w:lang w:val="en-US"/>
         </w:rPr>
-        <w:t>`jupyter notebook` to open a notebook (an html page will open</w:t>
+        <w:t>`</w:t>
+      </w:r>
+      <w:proofErr w:type="spellStart"/>
+      <w:r>
+        <w:rPr>
+          <w:lang w:val="en-US"/>
+        </w:rPr>
+        <w:t>jupyter</w:t>
+      </w:r>
+      <w:proofErr w:type="spellEnd"/>
+      <w:r>
+        <w:rPr>
+          <w:lang w:val="en-US"/>
+        </w:rPr>
+        <w:t xml:space="preserve"> notebook` to open a notebook (an html page will open</w:t>
       </w:r>
       <w:r>
         <w:rPr>
@@ -1732,7 +1883,21 @@
         <w:rPr>
           <w:lang w:val="en-US"/>
         </w:rPr>
-        <w:t xml:space="preserve">Run `voila inspect_edf_voila.ipynb` to </w:t>
+        <w:t xml:space="preserve">Run `voila </w:t>
+      </w:r>
+      <w:proofErr w:type="spellStart"/>
+      <w:r>
+        <w:rPr>
+          <w:lang w:val="en-US"/>
+        </w:rPr>
+        <w:t>inspect_edf_voila.ipynb</w:t>
+      </w:r>
+      <w:proofErr w:type="spellEnd"/>
+      <w:r>
+        <w:rPr>
+          <w:lang w:val="en-US"/>
+        </w:rPr>
+        <w:t xml:space="preserve">` to </w:t>
       </w:r>
       <w:r>
         <w:rPr>
@@ -1756,7 +1921,22 @@
         <w:rPr>
           <w:lang w:val="en-US"/>
         </w:rPr>
-        <w:t xml:space="preserve">Run `python my_script_name` to </w:t>
+        <w:lastRenderedPageBreak/>
+        <w:t xml:space="preserve">Run `python </w:t>
+      </w:r>
+      <w:proofErr w:type="spellStart"/>
+      <w:r>
+        <w:rPr>
+          <w:lang w:val="en-US"/>
+        </w:rPr>
+        <w:t>my_script_name</w:t>
+      </w:r>
+      <w:proofErr w:type="spellEnd"/>
+      <w:r>
+        <w:rPr>
+          <w:lang w:val="en-US"/>
+        </w:rPr>
+        <w:t xml:space="preserve">` to </w:t>
       </w:r>
       <w:r>
         <w:rPr>
@@ -1776,7 +1956,7 @@
     <w:sectPr>
       <w:headerReference w:type="default" r:id="rId7"/>
       <w:footerReference w:type="default" r:id="rId8"/>
-      <w:pgSz w:w="11906" w:h="16838" w:orient="portrait"/>
+      <w:pgSz w:w="11906" w:h="16838"/>
       <w:pgMar w:top="1417" w:right="1417" w:bottom="1417" w:left="1417" w:header="708" w:footer="708" w:gutter="0"/>
       <w:cols w:space="708"/>
       <w:docGrid w:linePitch="360"/>
@@ -1967,7 +2147,7 @@
             <w:rPr>
               <w:noProof/>
             </w:rPr>
-            <w:t>26.09.25</w:t>
+            <w:t>03.10.25</w:t>
           </w:r>
           <w:r>
             <w:fldChar w:fldCharType="end"/>
@@ -2020,7 +2200,7 @@
         <w:ind w:left="1800" w:hanging="360"/>
       </w:pPr>
       <w:rPr>
-        <w:rFonts w:hint="default" w:ascii="Wingdings" w:hAnsi="Wingdings"/>
+        <w:rFonts w:ascii="Wingdings" w:hAnsi="Wingdings" w:hint="default"/>
       </w:rPr>
     </w:lvl>
     <w:lvl w:ilvl="1" w:tplc="301CECE6">
@@ -2032,7 +2212,7 @@
         <w:ind w:left="2520" w:hanging="360"/>
       </w:pPr>
       <w:rPr>
-        <w:rFonts w:hint="default" w:ascii="Courier New" w:hAnsi="Courier New"/>
+        <w:rFonts w:ascii="Courier New" w:hAnsi="Courier New" w:hint="default"/>
       </w:rPr>
     </w:lvl>
     <w:lvl w:ilvl="2" w:tplc="E46A40E4">
@@ -2044,7 +2224,7 @@
         <w:ind w:left="3240" w:hanging="360"/>
       </w:pPr>
       <w:rPr>
-        <w:rFonts w:hint="default" w:ascii="Wingdings" w:hAnsi="Wingdings"/>
+        <w:rFonts w:ascii="Wingdings" w:hAnsi="Wingdings" w:hint="default"/>
       </w:rPr>
     </w:lvl>
     <w:lvl w:ilvl="3" w:tplc="F95CC7DC">
@@ -2056,7 +2236,7 @@
         <w:ind w:left="3960" w:hanging="360"/>
       </w:pPr>
       <w:rPr>
-        <w:rFonts w:hint="default" w:ascii="Symbol" w:hAnsi="Symbol"/>
+        <w:rFonts w:ascii="Symbol" w:hAnsi="Symbol" w:hint="default"/>
       </w:rPr>
     </w:lvl>
     <w:lvl w:ilvl="4" w:tplc="D4DC7D3C">
@@ -2068,7 +2248,7 @@
         <w:ind w:left="4680" w:hanging="360"/>
       </w:pPr>
       <w:rPr>
-        <w:rFonts w:hint="default" w:ascii="Courier New" w:hAnsi="Courier New"/>
+        <w:rFonts w:ascii="Courier New" w:hAnsi="Courier New" w:hint="default"/>
       </w:rPr>
     </w:lvl>
     <w:lvl w:ilvl="5" w:tplc="0428BC6E">
@@ -2080,7 +2260,7 @@
         <w:ind w:left="5400" w:hanging="360"/>
       </w:pPr>
       <w:rPr>
-        <w:rFonts w:hint="default" w:ascii="Wingdings" w:hAnsi="Wingdings"/>
+        <w:rFonts w:ascii="Wingdings" w:hAnsi="Wingdings" w:hint="default"/>
       </w:rPr>
     </w:lvl>
     <w:lvl w:ilvl="6" w:tplc="45F8CD1A">
@@ -2092,7 +2272,7 @@
         <w:ind w:left="6120" w:hanging="360"/>
       </w:pPr>
       <w:rPr>
-        <w:rFonts w:hint="default" w:ascii="Symbol" w:hAnsi="Symbol"/>
+        <w:rFonts w:ascii="Symbol" w:hAnsi="Symbol" w:hint="default"/>
       </w:rPr>
     </w:lvl>
     <w:lvl w:ilvl="7" w:tplc="0D526218">
@@ -2104,7 +2284,7 @@
         <w:ind w:left="6840" w:hanging="360"/>
       </w:pPr>
       <w:rPr>
-        <w:rFonts w:hint="default" w:ascii="Courier New" w:hAnsi="Courier New"/>
+        <w:rFonts w:ascii="Courier New" w:hAnsi="Courier New" w:hint="default"/>
       </w:rPr>
     </w:lvl>
     <w:lvl w:ilvl="8" w:tplc="8774F1D2">
@@ -2116,7 +2296,7 @@
         <w:ind w:left="7560" w:hanging="360"/>
       </w:pPr>
       <w:rPr>
-        <w:rFonts w:hint="default" w:ascii="Wingdings" w:hAnsi="Wingdings"/>
+        <w:rFonts w:ascii="Wingdings" w:hAnsi="Wingdings" w:hint="default"/>
       </w:rPr>
     </w:lvl>
   </w:abstractNum>
@@ -2311,7 +2491,7 @@
         <w:ind w:left="720" w:hanging="360"/>
       </w:pPr>
       <w:rPr>
-        <w:rFonts w:hint="default" w:ascii="Aptos" w:hAnsi="Aptos"/>
+        <w:rFonts w:ascii="Aptos" w:hAnsi="Aptos" w:hint="default"/>
       </w:rPr>
     </w:lvl>
     <w:lvl w:ilvl="1" w:tplc="64323700">
@@ -2323,7 +2503,7 @@
         <w:ind w:left="1440" w:hanging="360"/>
       </w:pPr>
       <w:rPr>
-        <w:rFonts w:hint="default" w:ascii="Courier New" w:hAnsi="Courier New"/>
+        <w:rFonts w:ascii="Courier New" w:hAnsi="Courier New" w:hint="default"/>
       </w:rPr>
     </w:lvl>
     <w:lvl w:ilvl="2" w:tplc="65FE1F32">
@@ -2335,7 +2515,7 @@
         <w:ind w:left="2160" w:hanging="360"/>
       </w:pPr>
       <w:rPr>
-        <w:rFonts w:hint="default" w:ascii="Wingdings" w:hAnsi="Wingdings"/>
+        <w:rFonts w:ascii="Wingdings" w:hAnsi="Wingdings" w:hint="default"/>
       </w:rPr>
     </w:lvl>
     <w:lvl w:ilvl="3" w:tplc="1268710C">
@@ -2347,7 +2527,7 @@
         <w:ind w:left="2880" w:hanging="360"/>
       </w:pPr>
       <w:rPr>
-        <w:rFonts w:hint="default" w:ascii="Symbol" w:hAnsi="Symbol"/>
+        <w:rFonts w:ascii="Symbol" w:hAnsi="Symbol" w:hint="default"/>
       </w:rPr>
     </w:lvl>
     <w:lvl w:ilvl="4" w:tplc="70D0428A">
@@ -2359,7 +2539,7 @@
         <w:ind w:left="3600" w:hanging="360"/>
       </w:pPr>
       <w:rPr>
-        <w:rFonts w:hint="default" w:ascii="Courier New" w:hAnsi="Courier New"/>
+        <w:rFonts w:ascii="Courier New" w:hAnsi="Courier New" w:hint="default"/>
       </w:rPr>
     </w:lvl>
     <w:lvl w:ilvl="5" w:tplc="2BC6976A">
@@ -2371,7 +2551,7 @@
         <w:ind w:left="4320" w:hanging="360"/>
       </w:pPr>
       <w:rPr>
-        <w:rFonts w:hint="default" w:ascii="Wingdings" w:hAnsi="Wingdings"/>
+        <w:rFonts w:ascii="Wingdings" w:hAnsi="Wingdings" w:hint="default"/>
       </w:rPr>
     </w:lvl>
     <w:lvl w:ilvl="6" w:tplc="653404EA">
@@ -2383,7 +2563,7 @@
         <w:ind w:left="5040" w:hanging="360"/>
       </w:pPr>
       <w:rPr>
-        <w:rFonts w:hint="default" w:ascii="Symbol" w:hAnsi="Symbol"/>
+        <w:rFonts w:ascii="Symbol" w:hAnsi="Symbol" w:hint="default"/>
       </w:rPr>
     </w:lvl>
     <w:lvl w:ilvl="7" w:tplc="D9D66648">
@@ -2395,7 +2575,7 @@
         <w:ind w:left="5760" w:hanging="360"/>
       </w:pPr>
       <w:rPr>
-        <w:rFonts w:hint="default" w:ascii="Courier New" w:hAnsi="Courier New"/>
+        <w:rFonts w:ascii="Courier New" w:hAnsi="Courier New" w:hint="default"/>
       </w:rPr>
     </w:lvl>
     <w:lvl w:ilvl="8" w:tplc="5AAE51D0">
@@ -2407,7 +2587,7 @@
         <w:ind w:left="6480" w:hanging="360"/>
       </w:pPr>
       <w:rPr>
-        <w:rFonts w:hint="default" w:ascii="Wingdings" w:hAnsi="Wingdings"/>
+        <w:rFonts w:ascii="Wingdings" w:hAnsi="Wingdings" w:hint="default"/>
       </w:rPr>
     </w:lvl>
   </w:abstractNum>
@@ -2424,7 +2604,7 @@
         <w:ind w:left="1800" w:hanging="360"/>
       </w:pPr>
       <w:rPr>
-        <w:rFonts w:hint="default" w:ascii="Aptos" w:hAnsi="Aptos"/>
+        <w:rFonts w:ascii="Aptos" w:hAnsi="Aptos" w:hint="default"/>
       </w:rPr>
     </w:lvl>
     <w:lvl w:ilvl="1" w:tplc="9FD8C998">
@@ -2436,7 +2616,7 @@
         <w:ind w:left="2520" w:hanging="360"/>
       </w:pPr>
       <w:rPr>
-        <w:rFonts w:hint="default" w:ascii="Courier New" w:hAnsi="Courier New"/>
+        <w:rFonts w:ascii="Courier New" w:hAnsi="Courier New" w:hint="default"/>
       </w:rPr>
     </w:lvl>
     <w:lvl w:ilvl="2" w:tplc="6CEE67F4">
@@ -2448,7 +2628,7 @@
         <w:ind w:left="3240" w:hanging="360"/>
       </w:pPr>
       <w:rPr>
-        <w:rFonts w:hint="default" w:ascii="Wingdings" w:hAnsi="Wingdings"/>
+        <w:rFonts w:ascii="Wingdings" w:hAnsi="Wingdings" w:hint="default"/>
       </w:rPr>
     </w:lvl>
     <w:lvl w:ilvl="3" w:tplc="60864DBC">
@@ -2460,7 +2640,7 @@
         <w:ind w:left="3960" w:hanging="360"/>
       </w:pPr>
       <w:rPr>
-        <w:rFonts w:hint="default" w:ascii="Symbol" w:hAnsi="Symbol"/>
+        <w:rFonts w:ascii="Symbol" w:hAnsi="Symbol" w:hint="default"/>
       </w:rPr>
     </w:lvl>
     <w:lvl w:ilvl="4" w:tplc="A3A0D178">
@@ -2472,7 +2652,7 @@
         <w:ind w:left="4680" w:hanging="360"/>
       </w:pPr>
       <w:rPr>
-        <w:rFonts w:hint="default" w:ascii="Courier New" w:hAnsi="Courier New"/>
+        <w:rFonts w:ascii="Courier New" w:hAnsi="Courier New" w:hint="default"/>
       </w:rPr>
     </w:lvl>
     <w:lvl w:ilvl="5" w:tplc="9362BA36">
@@ -2484,7 +2664,7 @@
         <w:ind w:left="5400" w:hanging="360"/>
       </w:pPr>
       <w:rPr>
-        <w:rFonts w:hint="default" w:ascii="Wingdings" w:hAnsi="Wingdings"/>
+        <w:rFonts w:ascii="Wingdings" w:hAnsi="Wingdings" w:hint="default"/>
       </w:rPr>
     </w:lvl>
     <w:lvl w:ilvl="6" w:tplc="57443374">
@@ -2496,7 +2676,7 @@
         <w:ind w:left="6120" w:hanging="360"/>
       </w:pPr>
       <w:rPr>
-        <w:rFonts w:hint="default" w:ascii="Symbol" w:hAnsi="Symbol"/>
+        <w:rFonts w:ascii="Symbol" w:hAnsi="Symbol" w:hint="default"/>
       </w:rPr>
     </w:lvl>
     <w:lvl w:ilvl="7" w:tplc="676639E4">
@@ -2508,7 +2688,7 @@
         <w:ind w:left="6840" w:hanging="360"/>
       </w:pPr>
       <w:rPr>
-        <w:rFonts w:hint="default" w:ascii="Courier New" w:hAnsi="Courier New"/>
+        <w:rFonts w:ascii="Courier New" w:hAnsi="Courier New" w:hint="default"/>
       </w:rPr>
     </w:lvl>
     <w:lvl w:ilvl="8" w:tplc="5B1494D8">
@@ -2520,7 +2700,7 @@
         <w:ind w:left="7560" w:hanging="360"/>
       </w:pPr>
       <w:rPr>
-        <w:rFonts w:hint="default" w:ascii="Wingdings" w:hAnsi="Wingdings"/>
+        <w:rFonts w:ascii="Wingdings" w:hAnsi="Wingdings" w:hint="default"/>
       </w:rPr>
     </w:lvl>
   </w:abstractNum>
@@ -2537,7 +2717,7 @@
         <w:ind w:left="1440" w:hanging="360"/>
       </w:pPr>
       <w:rPr>
-        <w:rFonts w:hint="default" w:ascii="Symbol" w:hAnsi="Symbol"/>
+        <w:rFonts w:ascii="Symbol" w:hAnsi="Symbol" w:hint="default"/>
       </w:rPr>
     </w:lvl>
     <w:lvl w:ilvl="1" w:tplc="040C0003">
@@ -2549,7 +2729,7 @@
         <w:ind w:left="2160" w:hanging="360"/>
       </w:pPr>
       <w:rPr>
-        <w:rFonts w:hint="default" w:ascii="Courier New" w:hAnsi="Courier New" w:cs="Courier New"/>
+        <w:rFonts w:ascii="Courier New" w:hAnsi="Courier New" w:cs="Courier New" w:hint="default"/>
       </w:rPr>
     </w:lvl>
     <w:lvl w:ilvl="2" w:tplc="040C0005" w:tentative="1">
@@ -2561,7 +2741,7 @@
         <w:ind w:left="2880" w:hanging="360"/>
       </w:pPr>
       <w:rPr>
-        <w:rFonts w:hint="default" w:ascii="Wingdings" w:hAnsi="Wingdings"/>
+        <w:rFonts w:ascii="Wingdings" w:hAnsi="Wingdings" w:hint="default"/>
       </w:rPr>
     </w:lvl>
     <w:lvl w:ilvl="3" w:tplc="040C0001" w:tentative="1">
@@ -2573,7 +2753,7 @@
         <w:ind w:left="3600" w:hanging="360"/>
       </w:pPr>
       <w:rPr>
-        <w:rFonts w:hint="default" w:ascii="Symbol" w:hAnsi="Symbol"/>
+        <w:rFonts w:ascii="Symbol" w:hAnsi="Symbol" w:hint="default"/>
       </w:rPr>
     </w:lvl>
     <w:lvl w:ilvl="4" w:tplc="040C0003" w:tentative="1">
@@ -2585,7 +2765,7 @@
         <w:ind w:left="4320" w:hanging="360"/>
       </w:pPr>
       <w:rPr>
-        <w:rFonts w:hint="default" w:ascii="Courier New" w:hAnsi="Courier New" w:cs="Courier New"/>
+        <w:rFonts w:ascii="Courier New" w:hAnsi="Courier New" w:cs="Courier New" w:hint="default"/>
       </w:rPr>
     </w:lvl>
     <w:lvl w:ilvl="5" w:tplc="040C0005" w:tentative="1">
@@ -2597,7 +2777,7 @@
         <w:ind w:left="5040" w:hanging="360"/>
       </w:pPr>
       <w:rPr>
-        <w:rFonts w:hint="default" w:ascii="Wingdings" w:hAnsi="Wingdings"/>
+        <w:rFonts w:ascii="Wingdings" w:hAnsi="Wingdings" w:hint="default"/>
       </w:rPr>
     </w:lvl>
     <w:lvl w:ilvl="6" w:tplc="040C0001" w:tentative="1">
@@ -2609,7 +2789,7 @@
         <w:ind w:left="5760" w:hanging="360"/>
       </w:pPr>
       <w:rPr>
-        <w:rFonts w:hint="default" w:ascii="Symbol" w:hAnsi="Symbol"/>
+        <w:rFonts w:ascii="Symbol" w:hAnsi="Symbol" w:hint="default"/>
       </w:rPr>
     </w:lvl>
     <w:lvl w:ilvl="7" w:tplc="040C0003" w:tentative="1">
@@ -2621,7 +2801,7 @@
         <w:ind w:left="6480" w:hanging="360"/>
       </w:pPr>
       <w:rPr>
-        <w:rFonts w:hint="default" w:ascii="Courier New" w:hAnsi="Courier New" w:cs="Courier New"/>
+        <w:rFonts w:ascii="Courier New" w:hAnsi="Courier New" w:cs="Courier New" w:hint="default"/>
       </w:rPr>
     </w:lvl>
     <w:lvl w:ilvl="8" w:tplc="040C0005" w:tentative="1">
@@ -2633,7 +2813,7 @@
         <w:ind w:left="7200" w:hanging="360"/>
       </w:pPr>
       <w:rPr>
-        <w:rFonts w:hint="default" w:ascii="Wingdings" w:hAnsi="Wingdings"/>
+        <w:rFonts w:ascii="Wingdings" w:hAnsi="Wingdings" w:hint="default"/>
       </w:rPr>
     </w:lvl>
   </w:abstractNum>
@@ -2650,7 +2830,7 @@
         <w:ind w:left="1080" w:hanging="360"/>
       </w:pPr>
       <w:rPr>
-        <w:rFonts w:hint="default" w:ascii="Aptos" w:hAnsi="Aptos"/>
+        <w:rFonts w:ascii="Aptos" w:hAnsi="Aptos" w:hint="default"/>
       </w:rPr>
     </w:lvl>
     <w:lvl w:ilvl="1" w:tplc="321819AC">
@@ -2662,7 +2842,7 @@
         <w:ind w:left="1800" w:hanging="360"/>
       </w:pPr>
       <w:rPr>
-        <w:rFonts w:hint="default" w:ascii="Courier New" w:hAnsi="Courier New"/>
+        <w:rFonts w:ascii="Courier New" w:hAnsi="Courier New" w:hint="default"/>
       </w:rPr>
     </w:lvl>
     <w:lvl w:ilvl="2" w:tplc="40CAF44C">
@@ -2674,7 +2854,7 @@
         <w:ind w:left="2520" w:hanging="360"/>
       </w:pPr>
       <w:rPr>
-        <w:rFonts w:hint="default" w:ascii="Wingdings" w:hAnsi="Wingdings"/>
+        <w:rFonts w:ascii="Wingdings" w:hAnsi="Wingdings" w:hint="default"/>
       </w:rPr>
     </w:lvl>
     <w:lvl w:ilvl="3" w:tplc="B07AD574">
@@ -2686,7 +2866,7 @@
         <w:ind w:left="3240" w:hanging="360"/>
       </w:pPr>
       <w:rPr>
-        <w:rFonts w:hint="default" w:ascii="Symbol" w:hAnsi="Symbol"/>
+        <w:rFonts w:ascii="Symbol" w:hAnsi="Symbol" w:hint="default"/>
       </w:rPr>
     </w:lvl>
     <w:lvl w:ilvl="4" w:tplc="833E444A">
@@ -2698,7 +2878,7 @@
         <w:ind w:left="3960" w:hanging="360"/>
       </w:pPr>
       <w:rPr>
-        <w:rFonts w:hint="default" w:ascii="Courier New" w:hAnsi="Courier New"/>
+        <w:rFonts w:ascii="Courier New" w:hAnsi="Courier New" w:hint="default"/>
       </w:rPr>
     </w:lvl>
     <w:lvl w:ilvl="5" w:tplc="3AA8C5B2">
@@ -2710,7 +2890,7 @@
         <w:ind w:left="4680" w:hanging="360"/>
       </w:pPr>
       <w:rPr>
-        <w:rFonts w:hint="default" w:ascii="Wingdings" w:hAnsi="Wingdings"/>
+        <w:rFonts w:ascii="Wingdings" w:hAnsi="Wingdings" w:hint="default"/>
       </w:rPr>
     </w:lvl>
     <w:lvl w:ilvl="6" w:tplc="DD7A4F4A">
@@ -2722,7 +2902,7 @@
         <w:ind w:left="5400" w:hanging="360"/>
       </w:pPr>
       <w:rPr>
-        <w:rFonts w:hint="default" w:ascii="Symbol" w:hAnsi="Symbol"/>
+        <w:rFonts w:ascii="Symbol" w:hAnsi="Symbol" w:hint="default"/>
       </w:rPr>
     </w:lvl>
     <w:lvl w:ilvl="7" w:tplc="38AA1F26">
@@ -2734,7 +2914,7 @@
         <w:ind w:left="6120" w:hanging="360"/>
       </w:pPr>
       <w:rPr>
-        <w:rFonts w:hint="default" w:ascii="Courier New" w:hAnsi="Courier New"/>
+        <w:rFonts w:ascii="Courier New" w:hAnsi="Courier New" w:hint="default"/>
       </w:rPr>
     </w:lvl>
     <w:lvl w:ilvl="8" w:tplc="3D8A507C">
@@ -2746,7 +2926,7 @@
         <w:ind w:left="6840" w:hanging="360"/>
       </w:pPr>
       <w:rPr>
-        <w:rFonts w:hint="default" w:ascii="Wingdings" w:hAnsi="Wingdings"/>
+        <w:rFonts w:ascii="Wingdings" w:hAnsi="Wingdings" w:hint="default"/>
       </w:rPr>
     </w:lvl>
   </w:abstractNum>
@@ -2763,7 +2943,7 @@
         <w:ind w:left="1080" w:hanging="360"/>
       </w:pPr>
       <w:rPr>
-        <w:rFonts w:hint="default" w:ascii="Aptos" w:hAnsi="Aptos"/>
+        <w:rFonts w:ascii="Aptos" w:hAnsi="Aptos" w:hint="default"/>
       </w:rPr>
     </w:lvl>
     <w:lvl w:ilvl="1" w:tplc="60065968">
@@ -2775,7 +2955,7 @@
         <w:ind w:left="1800" w:hanging="360"/>
       </w:pPr>
       <w:rPr>
-        <w:rFonts w:hint="default" w:ascii="Courier New" w:hAnsi="Courier New"/>
+        <w:rFonts w:ascii="Courier New" w:hAnsi="Courier New" w:hint="default"/>
       </w:rPr>
     </w:lvl>
     <w:lvl w:ilvl="2" w:tplc="77707748">
@@ -2787,7 +2967,7 @@
         <w:ind w:left="2520" w:hanging="360"/>
       </w:pPr>
       <w:rPr>
-        <w:rFonts w:hint="default" w:ascii="Wingdings" w:hAnsi="Wingdings"/>
+        <w:rFonts w:ascii="Wingdings" w:hAnsi="Wingdings" w:hint="default"/>
       </w:rPr>
     </w:lvl>
     <w:lvl w:ilvl="3" w:tplc="65A2825E">
@@ -2799,7 +2979,7 @@
         <w:ind w:left="3240" w:hanging="360"/>
       </w:pPr>
       <w:rPr>
-        <w:rFonts w:hint="default" w:ascii="Symbol" w:hAnsi="Symbol"/>
+        <w:rFonts w:ascii="Symbol" w:hAnsi="Symbol" w:hint="default"/>
       </w:rPr>
     </w:lvl>
     <w:lvl w:ilvl="4" w:tplc="E93AFFC4">
@@ -2811,7 +2991,7 @@
         <w:ind w:left="3960" w:hanging="360"/>
       </w:pPr>
       <w:rPr>
-        <w:rFonts w:hint="default" w:ascii="Courier New" w:hAnsi="Courier New"/>
+        <w:rFonts w:ascii="Courier New" w:hAnsi="Courier New" w:hint="default"/>
       </w:rPr>
     </w:lvl>
     <w:lvl w:ilvl="5" w:tplc="AB963E4C">
@@ -2823,7 +3003,7 @@
         <w:ind w:left="4680" w:hanging="360"/>
       </w:pPr>
       <w:rPr>
-        <w:rFonts w:hint="default" w:ascii="Wingdings" w:hAnsi="Wingdings"/>
+        <w:rFonts w:ascii="Wingdings" w:hAnsi="Wingdings" w:hint="default"/>
       </w:rPr>
     </w:lvl>
     <w:lvl w:ilvl="6" w:tplc="7304C748">
@@ -2835,7 +3015,7 @@
         <w:ind w:left="5400" w:hanging="360"/>
       </w:pPr>
       <w:rPr>
-        <w:rFonts w:hint="default" w:ascii="Symbol" w:hAnsi="Symbol"/>
+        <w:rFonts w:ascii="Symbol" w:hAnsi="Symbol" w:hint="default"/>
       </w:rPr>
     </w:lvl>
     <w:lvl w:ilvl="7" w:tplc="9FEC8AA6">
@@ -2847,7 +3027,7 @@
         <w:ind w:left="6120" w:hanging="360"/>
       </w:pPr>
       <w:rPr>
-        <w:rFonts w:hint="default" w:ascii="Courier New" w:hAnsi="Courier New"/>
+        <w:rFonts w:ascii="Courier New" w:hAnsi="Courier New" w:hint="default"/>
       </w:rPr>
     </w:lvl>
     <w:lvl w:ilvl="8" w:tplc="A87C22FA">
@@ -2859,7 +3039,7 @@
         <w:ind w:left="6840" w:hanging="360"/>
       </w:pPr>
       <w:rPr>
-        <w:rFonts w:hint="default" w:ascii="Wingdings" w:hAnsi="Wingdings"/>
+        <w:rFonts w:ascii="Wingdings" w:hAnsi="Wingdings" w:hint="default"/>
       </w:rPr>
     </w:lvl>
   </w:abstractNum>
@@ -2875,7 +3055,7 @@
         <w:ind w:left="720" w:hanging="360"/>
       </w:pPr>
       <w:rPr>
-        <w:rFonts w:hint="default" w:ascii="Aptos" w:hAnsi="Aptos" w:eastAsiaTheme="minorHAnsi" w:cstheme="minorBidi"/>
+        <w:rFonts w:ascii="Aptos" w:eastAsiaTheme="minorHAnsi" w:hAnsi="Aptos" w:cstheme="minorBidi" w:hint="default"/>
       </w:rPr>
     </w:lvl>
     <w:lvl w:ilvl="1" w:tplc="040C0003">
@@ -2887,10 +3067,10 @@
         <w:ind w:left="1440" w:hanging="360"/>
       </w:pPr>
       <w:rPr>
-        <w:rFonts w:hint="default" w:ascii="Courier New" w:hAnsi="Courier New" w:cs="Courier New"/>
-      </w:rPr>
-    </w:lvl>
-    <w:lvl w:ilvl="2" w:tplc="040C0005" w:tentative="1">
+        <w:rFonts w:ascii="Courier New" w:hAnsi="Courier New" w:cs="Courier New" w:hint="default"/>
+      </w:rPr>
+    </w:lvl>
+    <w:lvl w:ilvl="2" w:tplc="040C0005">
       <w:start w:val="1"/>
       <w:numFmt w:val="bullet"/>
       <w:lvlText w:val=""/>
@@ -2899,7 +3079,7 @@
         <w:ind w:left="2160" w:hanging="360"/>
       </w:pPr>
       <w:rPr>
-        <w:rFonts w:hint="default" w:ascii="Wingdings" w:hAnsi="Wingdings"/>
+        <w:rFonts w:ascii="Wingdings" w:hAnsi="Wingdings" w:hint="default"/>
       </w:rPr>
     </w:lvl>
     <w:lvl w:ilvl="3" w:tplc="040C0001" w:tentative="1">
@@ -2911,7 +3091,7 @@
         <w:ind w:left="2880" w:hanging="360"/>
       </w:pPr>
       <w:rPr>
-        <w:rFonts w:hint="default" w:ascii="Symbol" w:hAnsi="Symbol"/>
+        <w:rFonts w:ascii="Symbol" w:hAnsi="Symbol" w:hint="default"/>
       </w:rPr>
     </w:lvl>
     <w:lvl w:ilvl="4" w:tplc="040C0003" w:tentative="1">
@@ -2923,7 +3103,7 @@
         <w:ind w:left="3600" w:hanging="360"/>
       </w:pPr>
       <w:rPr>
-        <w:rFonts w:hint="default" w:ascii="Courier New" w:hAnsi="Courier New" w:cs="Courier New"/>
+        <w:rFonts w:ascii="Courier New" w:hAnsi="Courier New" w:cs="Courier New" w:hint="default"/>
       </w:rPr>
     </w:lvl>
     <w:lvl w:ilvl="5" w:tplc="040C0005" w:tentative="1">
@@ -2935,7 +3115,7 @@
         <w:ind w:left="4320" w:hanging="360"/>
       </w:pPr>
       <w:rPr>
-        <w:rFonts w:hint="default" w:ascii="Wingdings" w:hAnsi="Wingdings"/>
+        <w:rFonts w:ascii="Wingdings" w:hAnsi="Wingdings" w:hint="default"/>
       </w:rPr>
     </w:lvl>
     <w:lvl w:ilvl="6" w:tplc="040C0001" w:tentative="1">
@@ -2947,7 +3127,7 @@
         <w:ind w:left="5040" w:hanging="360"/>
       </w:pPr>
       <w:rPr>
-        <w:rFonts w:hint="default" w:ascii="Symbol" w:hAnsi="Symbol"/>
+        <w:rFonts w:ascii="Symbol" w:hAnsi="Symbol" w:hint="default"/>
       </w:rPr>
     </w:lvl>
     <w:lvl w:ilvl="7" w:tplc="040C0003" w:tentative="1">
@@ -2959,7 +3139,7 @@
         <w:ind w:left="5760" w:hanging="360"/>
       </w:pPr>
       <w:rPr>
-        <w:rFonts w:hint="default" w:ascii="Courier New" w:hAnsi="Courier New" w:cs="Courier New"/>
+        <w:rFonts w:ascii="Courier New" w:hAnsi="Courier New" w:cs="Courier New" w:hint="default"/>
       </w:rPr>
     </w:lvl>
     <w:lvl w:ilvl="8" w:tplc="040C0005" w:tentative="1">
@@ -2971,7 +3151,7 @@
         <w:ind w:left="6480" w:hanging="360"/>
       </w:pPr>
       <w:rPr>
-        <w:rFonts w:hint="default" w:ascii="Wingdings" w:hAnsi="Wingdings"/>
+        <w:rFonts w:ascii="Wingdings" w:hAnsi="Wingdings" w:hint="default"/>
       </w:rPr>
     </w:lvl>
   </w:abstractNum>
@@ -2988,7 +3168,7 @@
         <w:ind w:left="1800" w:hanging="360"/>
       </w:pPr>
       <w:rPr>
-        <w:rFonts w:hint="default" w:ascii="Wingdings" w:hAnsi="Wingdings" w:eastAsiaTheme="minorHAnsi" w:cstheme="minorBidi"/>
+        <w:rFonts w:ascii="Wingdings" w:eastAsiaTheme="minorHAnsi" w:hAnsi="Wingdings" w:cstheme="minorBidi" w:hint="default"/>
       </w:rPr>
     </w:lvl>
     <w:lvl w:ilvl="1" w:tplc="040C0003" w:tentative="1">
@@ -3000,7 +3180,7 @@
         <w:ind w:left="2520" w:hanging="360"/>
       </w:pPr>
       <w:rPr>
-        <w:rFonts w:hint="default" w:ascii="Courier New" w:hAnsi="Courier New" w:cs="Courier New"/>
+        <w:rFonts w:ascii="Courier New" w:hAnsi="Courier New" w:cs="Courier New" w:hint="default"/>
       </w:rPr>
     </w:lvl>
     <w:lvl w:ilvl="2" w:tplc="040C0005" w:tentative="1">
@@ -3012,7 +3192,7 @@
         <w:ind w:left="3240" w:hanging="360"/>
       </w:pPr>
       <w:rPr>
-        <w:rFonts w:hint="default" w:ascii="Wingdings" w:hAnsi="Wingdings"/>
+        <w:rFonts w:ascii="Wingdings" w:hAnsi="Wingdings" w:hint="default"/>
       </w:rPr>
     </w:lvl>
     <w:lvl w:ilvl="3" w:tplc="040C0001" w:tentative="1">
@@ -3024,7 +3204,7 @@
         <w:ind w:left="3960" w:hanging="360"/>
       </w:pPr>
       <w:rPr>
-        <w:rFonts w:hint="default" w:ascii="Symbol" w:hAnsi="Symbol"/>
+        <w:rFonts w:ascii="Symbol" w:hAnsi="Symbol" w:hint="default"/>
       </w:rPr>
     </w:lvl>
     <w:lvl w:ilvl="4" w:tplc="040C0003" w:tentative="1">
@@ -3036,7 +3216,7 @@
         <w:ind w:left="4680" w:hanging="360"/>
       </w:pPr>
       <w:rPr>
-        <w:rFonts w:hint="default" w:ascii="Courier New" w:hAnsi="Courier New" w:cs="Courier New"/>
+        <w:rFonts w:ascii="Courier New" w:hAnsi="Courier New" w:cs="Courier New" w:hint="default"/>
       </w:rPr>
     </w:lvl>
     <w:lvl w:ilvl="5" w:tplc="040C0005" w:tentative="1">
@@ -3048,7 +3228,7 @@
         <w:ind w:left="5400" w:hanging="360"/>
       </w:pPr>
       <w:rPr>
-        <w:rFonts w:hint="default" w:ascii="Wingdings" w:hAnsi="Wingdings"/>
+        <w:rFonts w:ascii="Wingdings" w:hAnsi="Wingdings" w:hint="default"/>
       </w:rPr>
     </w:lvl>
     <w:lvl w:ilvl="6" w:tplc="040C0001" w:tentative="1">
@@ -3060,7 +3240,7 @@
         <w:ind w:left="6120" w:hanging="360"/>
       </w:pPr>
       <w:rPr>
-        <w:rFonts w:hint="default" w:ascii="Symbol" w:hAnsi="Symbol"/>
+        <w:rFonts w:ascii="Symbol" w:hAnsi="Symbol" w:hint="default"/>
       </w:rPr>
     </w:lvl>
     <w:lvl w:ilvl="7" w:tplc="040C0003" w:tentative="1">
@@ -3072,7 +3252,7 @@
         <w:ind w:left="6840" w:hanging="360"/>
       </w:pPr>
       <w:rPr>
-        <w:rFonts w:hint="default" w:ascii="Courier New" w:hAnsi="Courier New" w:cs="Courier New"/>
+        <w:rFonts w:ascii="Courier New" w:hAnsi="Courier New" w:cs="Courier New" w:hint="default"/>
       </w:rPr>
     </w:lvl>
     <w:lvl w:ilvl="8" w:tplc="040C0005" w:tentative="1">
@@ -3084,7 +3264,7 @@
         <w:ind w:left="7560" w:hanging="360"/>
       </w:pPr>
       <w:rPr>
-        <w:rFonts w:hint="default" w:ascii="Wingdings" w:hAnsi="Wingdings"/>
+        <w:rFonts w:ascii="Wingdings" w:hAnsi="Wingdings" w:hint="default"/>
       </w:rPr>
     </w:lvl>
   </w:abstractNum>
@@ -3101,7 +3281,7 @@
         <w:ind w:left="1068" w:hanging="360"/>
       </w:pPr>
       <w:rPr>
-        <w:rFonts w:hint="default" w:ascii="Symbol" w:hAnsi="Symbol"/>
+        <w:rFonts w:ascii="Symbol" w:hAnsi="Symbol" w:hint="default"/>
       </w:rPr>
     </w:lvl>
     <w:lvl w:ilvl="1" w:tplc="DF7C2CAE">
@@ -3113,7 +3293,7 @@
         <w:ind w:left="1788" w:hanging="360"/>
       </w:pPr>
       <w:rPr>
-        <w:rFonts w:hint="default" w:ascii="Courier New" w:hAnsi="Courier New"/>
+        <w:rFonts w:ascii="Courier New" w:hAnsi="Courier New" w:hint="default"/>
       </w:rPr>
     </w:lvl>
     <w:lvl w:ilvl="2" w:tplc="8D50B50C">
@@ -3125,7 +3305,7 @@
         <w:ind w:left="2508" w:hanging="360"/>
       </w:pPr>
       <w:rPr>
-        <w:rFonts w:hint="default" w:ascii="Wingdings" w:hAnsi="Wingdings"/>
+        <w:rFonts w:ascii="Wingdings" w:hAnsi="Wingdings" w:hint="default"/>
       </w:rPr>
     </w:lvl>
     <w:lvl w:ilvl="3" w:tplc="1F8EDBFA">
@@ -3137,7 +3317,7 @@
         <w:ind w:left="3228" w:hanging="360"/>
       </w:pPr>
       <w:rPr>
-        <w:rFonts w:hint="default" w:ascii="Symbol" w:hAnsi="Symbol"/>
+        <w:rFonts w:ascii="Symbol" w:hAnsi="Symbol" w:hint="default"/>
       </w:rPr>
     </w:lvl>
     <w:lvl w:ilvl="4" w:tplc="BF92D06A">
@@ -3149,7 +3329,7 @@
         <w:ind w:left="3948" w:hanging="360"/>
       </w:pPr>
       <w:rPr>
-        <w:rFonts w:hint="default" w:ascii="Courier New" w:hAnsi="Courier New"/>
+        <w:rFonts w:ascii="Courier New" w:hAnsi="Courier New" w:hint="default"/>
       </w:rPr>
     </w:lvl>
     <w:lvl w:ilvl="5" w:tplc="15F266BA">
@@ -3161,7 +3341,7 @@
         <w:ind w:left="4668" w:hanging="360"/>
       </w:pPr>
       <w:rPr>
-        <w:rFonts w:hint="default" w:ascii="Wingdings" w:hAnsi="Wingdings"/>
+        <w:rFonts w:ascii="Wingdings" w:hAnsi="Wingdings" w:hint="default"/>
       </w:rPr>
     </w:lvl>
     <w:lvl w:ilvl="6" w:tplc="820C6BF6">
@@ -3173,7 +3353,7 @@
         <w:ind w:left="5388" w:hanging="360"/>
       </w:pPr>
       <w:rPr>
-        <w:rFonts w:hint="default" w:ascii="Symbol" w:hAnsi="Symbol"/>
+        <w:rFonts w:ascii="Symbol" w:hAnsi="Symbol" w:hint="default"/>
       </w:rPr>
     </w:lvl>
     <w:lvl w:ilvl="7" w:tplc="3732D6CA">
@@ -3185,7 +3365,7 @@
         <w:ind w:left="6108" w:hanging="360"/>
       </w:pPr>
       <w:rPr>
-        <w:rFonts w:hint="default" w:ascii="Courier New" w:hAnsi="Courier New"/>
+        <w:rFonts w:ascii="Courier New" w:hAnsi="Courier New" w:hint="default"/>
       </w:rPr>
     </w:lvl>
     <w:lvl w:ilvl="8" w:tplc="9AC0302C">
@@ -3197,7 +3377,7 @@
         <w:ind w:left="6828" w:hanging="360"/>
       </w:pPr>
       <w:rPr>
-        <w:rFonts w:hint="default" w:ascii="Wingdings" w:hAnsi="Wingdings"/>
+        <w:rFonts w:ascii="Wingdings" w:hAnsi="Wingdings" w:hint="default"/>
       </w:rPr>
     </w:lvl>
   </w:abstractNum>
@@ -3214,7 +3394,7 @@
         <w:ind w:left="1080" w:hanging="360"/>
       </w:pPr>
       <w:rPr>
-        <w:rFonts w:hint="default" w:ascii="Aptos" w:hAnsi="Aptos"/>
+        <w:rFonts w:ascii="Aptos" w:hAnsi="Aptos" w:hint="default"/>
       </w:rPr>
     </w:lvl>
     <w:lvl w:ilvl="1" w:tplc="61B614F2">
@@ -3226,7 +3406,7 @@
         <w:ind w:left="1800" w:hanging="360"/>
       </w:pPr>
       <w:rPr>
-        <w:rFonts w:hint="default" w:ascii="Courier New" w:hAnsi="Courier New"/>
+        <w:rFonts w:ascii="Courier New" w:hAnsi="Courier New" w:hint="default"/>
       </w:rPr>
     </w:lvl>
     <w:lvl w:ilvl="2" w:tplc="E924CE9C">
@@ -3238,7 +3418,7 @@
         <w:ind w:left="2520" w:hanging="360"/>
       </w:pPr>
       <w:rPr>
-        <w:rFonts w:hint="default" w:ascii="Wingdings" w:hAnsi="Wingdings"/>
+        <w:rFonts w:ascii="Wingdings" w:hAnsi="Wingdings" w:hint="default"/>
       </w:rPr>
     </w:lvl>
     <w:lvl w:ilvl="3" w:tplc="C61EE4C4">
@@ -3250,7 +3430,7 @@
         <w:ind w:left="3240" w:hanging="360"/>
       </w:pPr>
       <w:rPr>
-        <w:rFonts w:hint="default" w:ascii="Symbol" w:hAnsi="Symbol"/>
+        <w:rFonts w:ascii="Symbol" w:hAnsi="Symbol" w:hint="default"/>
       </w:rPr>
     </w:lvl>
     <w:lvl w:ilvl="4" w:tplc="E7F4FB66">
@@ -3262,7 +3442,7 @@
         <w:ind w:left="3960" w:hanging="360"/>
       </w:pPr>
       <w:rPr>
-        <w:rFonts w:hint="default" w:ascii="Courier New" w:hAnsi="Courier New"/>
+        <w:rFonts w:ascii="Courier New" w:hAnsi="Courier New" w:hint="default"/>
       </w:rPr>
     </w:lvl>
     <w:lvl w:ilvl="5" w:tplc="289AF2A2">
@@ -3274,7 +3454,7 @@
         <w:ind w:left="4680" w:hanging="360"/>
       </w:pPr>
       <w:rPr>
-        <w:rFonts w:hint="default" w:ascii="Wingdings" w:hAnsi="Wingdings"/>
+        <w:rFonts w:ascii="Wingdings" w:hAnsi="Wingdings" w:hint="default"/>
       </w:rPr>
     </w:lvl>
     <w:lvl w:ilvl="6" w:tplc="BBC27724">
@@ -3286,7 +3466,7 @@
         <w:ind w:left="5400" w:hanging="360"/>
       </w:pPr>
       <w:rPr>
-        <w:rFonts w:hint="default" w:ascii="Symbol" w:hAnsi="Symbol"/>
+        <w:rFonts w:ascii="Symbol" w:hAnsi="Symbol" w:hint="default"/>
       </w:rPr>
     </w:lvl>
     <w:lvl w:ilvl="7" w:tplc="3FF4D2D2">
@@ -3298,7 +3478,7 @@
         <w:ind w:left="6120" w:hanging="360"/>
       </w:pPr>
       <w:rPr>
-        <w:rFonts w:hint="default" w:ascii="Courier New" w:hAnsi="Courier New"/>
+        <w:rFonts w:ascii="Courier New" w:hAnsi="Courier New" w:hint="default"/>
       </w:rPr>
     </w:lvl>
     <w:lvl w:ilvl="8" w:tplc="49F25E82">
@@ -3310,7 +3490,7 @@
         <w:ind w:left="6840" w:hanging="360"/>
       </w:pPr>
       <w:rPr>
-        <w:rFonts w:hint="default" w:ascii="Wingdings" w:hAnsi="Wingdings"/>
+        <w:rFonts w:ascii="Wingdings" w:hAnsi="Wingdings" w:hint="default"/>
       </w:rPr>
     </w:lvl>
   </w:abstractNum>
@@ -3358,7 +3538,7 @@
   <w:docDefaults>
     <w:rPrDefault>
       <w:rPr>
-        <w:rFonts w:asciiTheme="minorHAnsi" w:hAnsiTheme="minorHAnsi" w:eastAsiaTheme="minorHAnsi" w:cstheme="minorBidi"/>
+        <w:rFonts w:asciiTheme="minorHAnsi" w:eastAsiaTheme="minorHAnsi" w:hAnsiTheme="minorHAnsi" w:cstheme="minorBidi"/>
         <w:kern w:val="2"/>
         <w:sz w:val="24"/>
         <w:szCs w:val="24"/>
@@ -3375,14 +3555,14 @@
   <w:latentStyles w:defLockedState="0" w:defUIPriority="99" w:defSemiHidden="0" w:defUnhideWhenUsed="0" w:defQFormat="0" w:count="376">
     <w:lsdException w:name="Normal" w:uiPriority="0" w:qFormat="1"/>
     <w:lsdException w:name="heading 1" w:uiPriority="9" w:qFormat="1"/>
-    <w:lsdException w:name="heading 2" w:uiPriority="9" w:semiHidden="1" w:unhideWhenUsed="1" w:qFormat="1"/>
-    <w:lsdException w:name="heading 3" w:uiPriority="9" w:semiHidden="1" w:unhideWhenUsed="1" w:qFormat="1"/>
-    <w:lsdException w:name="heading 4" w:uiPriority="9" w:semiHidden="1" w:unhideWhenUsed="1" w:qFormat="1"/>
-    <w:lsdException w:name="heading 5" w:uiPriority="9" w:semiHidden="1" w:unhideWhenUsed="1" w:qFormat="1"/>
-    <w:lsdException w:name="heading 6" w:uiPriority="9" w:semiHidden="1" w:unhideWhenUsed="1" w:qFormat="1"/>
-    <w:lsdException w:name="heading 7" w:uiPriority="9" w:semiHidden="1" w:unhideWhenUsed="1" w:qFormat="1"/>
-    <w:lsdException w:name="heading 8" w:uiPriority="9" w:semiHidden="1" w:unhideWhenUsed="1" w:qFormat="1"/>
-    <w:lsdException w:name="heading 9" w:uiPriority="9" w:semiHidden="1" w:unhideWhenUsed="1" w:qFormat="1"/>
+    <w:lsdException w:name="heading 2" w:semiHidden="1" w:uiPriority="9" w:unhideWhenUsed="1" w:qFormat="1"/>
+    <w:lsdException w:name="heading 3" w:semiHidden="1" w:uiPriority="9" w:unhideWhenUsed="1" w:qFormat="1"/>
+    <w:lsdException w:name="heading 4" w:semiHidden="1" w:uiPriority="9" w:unhideWhenUsed="1" w:qFormat="1"/>
+    <w:lsdException w:name="heading 5" w:semiHidden="1" w:uiPriority="9" w:unhideWhenUsed="1" w:qFormat="1"/>
+    <w:lsdException w:name="heading 6" w:semiHidden="1" w:uiPriority="9" w:unhideWhenUsed="1" w:qFormat="1"/>
+    <w:lsdException w:name="heading 7" w:semiHidden="1" w:uiPriority="9" w:unhideWhenUsed="1" w:qFormat="1"/>
+    <w:lsdException w:name="heading 8" w:semiHidden="1" w:uiPriority="9" w:unhideWhenUsed="1" w:qFormat="1"/>
+    <w:lsdException w:name="heading 9" w:semiHidden="1" w:uiPriority="9" w:unhideWhenUsed="1" w:qFormat="1"/>
     <w:lsdException w:name="index 1" w:semiHidden="1" w:unhideWhenUsed="1"/>
     <w:lsdException w:name="index 2" w:semiHidden="1" w:unhideWhenUsed="1"/>
     <w:lsdException w:name="index 3" w:semiHidden="1" w:unhideWhenUsed="1"/>
@@ -3392,22 +3572,22 @@
     <w:lsdException w:name="index 7" w:semiHidden="1" w:unhideWhenUsed="1"/>
     <w:lsdException w:name="index 8" w:semiHidden="1" w:unhideWhenUsed="1"/>
     <w:lsdException w:name="index 9" w:semiHidden="1" w:unhideWhenUsed="1"/>
-    <w:lsdException w:name="toc 1" w:uiPriority="39" w:semiHidden="1" w:unhideWhenUsed="1"/>
-    <w:lsdException w:name="toc 2" w:uiPriority="39" w:semiHidden="1" w:unhideWhenUsed="1"/>
-    <w:lsdException w:name="toc 3" w:uiPriority="39" w:semiHidden="1" w:unhideWhenUsed="1"/>
-    <w:lsdException w:name="toc 4" w:uiPriority="39" w:semiHidden="1" w:unhideWhenUsed="1"/>
-    <w:lsdException w:name="toc 5" w:uiPriority="39" w:semiHidden="1" w:unhideWhenUsed="1"/>
-    <w:lsdException w:name="toc 6" w:uiPriority="39" w:semiHidden="1" w:unhideWhenUsed="1"/>
-    <w:lsdException w:name="toc 7" w:uiPriority="39" w:semiHidden="1" w:unhideWhenUsed="1"/>
-    <w:lsdException w:name="toc 8" w:uiPriority="39" w:semiHidden="1" w:unhideWhenUsed="1"/>
-    <w:lsdException w:name="toc 9" w:uiPriority="39" w:semiHidden="1" w:unhideWhenUsed="1"/>
+    <w:lsdException w:name="toc 1" w:semiHidden="1" w:uiPriority="39" w:unhideWhenUsed="1"/>
+    <w:lsdException w:name="toc 2" w:semiHidden="1" w:uiPriority="39" w:unhideWhenUsed="1"/>
+    <w:lsdException w:name="toc 3" w:semiHidden="1" w:uiPriority="39" w:unhideWhenUsed="1"/>
+    <w:lsdException w:name="toc 4" w:semiHidden="1" w:uiPriority="39" w:unhideWhenUsed="1"/>
+    <w:lsdException w:name="toc 5" w:semiHidden="1" w:uiPriority="39" w:unhideWhenUsed="1"/>
+    <w:lsdException w:name="toc 6" w:semiHidden="1" w:uiPriority="39" w:unhideWhenUsed="1"/>
+    <w:lsdException w:name="toc 7" w:semiHidden="1" w:uiPriority="39" w:unhideWhenUsed="1"/>
+    <w:lsdException w:name="toc 8" w:semiHidden="1" w:uiPriority="39" w:unhideWhenUsed="1"/>
+    <w:lsdException w:name="toc 9" w:semiHidden="1" w:uiPriority="39" w:unhideWhenUsed="1"/>
     <w:lsdException w:name="Normal Indent" w:semiHidden="1" w:unhideWhenUsed="1"/>
     <w:lsdException w:name="footnote text" w:semiHidden="1" w:unhideWhenUsed="1"/>
     <w:lsdException w:name="annotation text" w:semiHidden="1" w:unhideWhenUsed="1"/>
     <w:lsdException w:name="header" w:semiHidden="1" w:unhideWhenUsed="1"/>
     <w:lsdException w:name="footer" w:semiHidden="1" w:unhideWhenUsed="1"/>
     <w:lsdException w:name="index heading" w:semiHidden="1" w:unhideWhenUsed="1"/>
-    <w:lsdException w:name="caption" w:uiPriority="35" w:semiHidden="1" w:unhideWhenUsed="1" w:qFormat="1"/>
+    <w:lsdException w:name="caption" w:semiHidden="1" w:uiPriority="35" w:unhideWhenUsed="1" w:qFormat="1"/>
     <w:lsdException w:name="table of figures" w:semiHidden="1" w:unhideWhenUsed="1"/>
     <w:lsdException w:name="envelope address" w:semiHidden="1" w:unhideWhenUsed="1"/>
     <w:lsdException w:name="envelope return" w:semiHidden="1" w:unhideWhenUsed="1"/>
@@ -3438,7 +3618,7 @@
     <w:lsdException w:name="Title" w:uiPriority="10" w:qFormat="1"/>
     <w:lsdException w:name="Closing" w:semiHidden="1" w:unhideWhenUsed="1"/>
     <w:lsdException w:name="Signature" w:semiHidden="1" w:unhideWhenUsed="1"/>
-    <w:lsdException w:name="Default Paragraph Font" w:uiPriority="1" w:semiHidden="1" w:unhideWhenUsed="1"/>
+    <w:lsdException w:name="Default Paragraph Font" w:semiHidden="1" w:uiPriority="1" w:unhideWhenUsed="1"/>
     <w:lsdException w:name="Body Text" w:semiHidden="1" w:unhideWhenUsed="1"/>
     <w:lsdException w:name="Body Text Indent" w:semiHidden="1" w:unhideWhenUsed="1"/>
     <w:lsdException w:name="List Continue" w:semiHidden="1" w:unhideWhenUsed="1"/>
@@ -3638,8 +3818,8 @@
     <w:lsdException w:name="Subtle Reference" w:uiPriority="31" w:qFormat="1"/>
     <w:lsdException w:name="Intense Reference" w:uiPriority="32" w:qFormat="1"/>
     <w:lsdException w:name="Book Title" w:uiPriority="33" w:qFormat="1"/>
-    <w:lsdException w:name="Bibliography" w:uiPriority="37" w:semiHidden="1" w:unhideWhenUsed="1"/>
-    <w:lsdException w:name="TOC Heading" w:uiPriority="39" w:semiHidden="1" w:unhideWhenUsed="1" w:qFormat="1"/>
+    <w:lsdException w:name="Bibliography" w:semiHidden="1" w:uiPriority="37" w:unhideWhenUsed="1"/>
+    <w:lsdException w:name="TOC Heading" w:semiHidden="1" w:uiPriority="39" w:unhideWhenUsed="1" w:qFormat="1"/>
     <w:lsdException w:name="Plain Table 1" w:uiPriority="41"/>
     <w:lsdException w:name="Plain Table 2" w:uiPriority="42"/>
     <w:lsdException w:name="Plain Table 3" w:uiPriority="43"/>
@@ -3750,7 +3930,7 @@
     <w:lsdException w:name="Unresolved Mention" w:semiHidden="1" w:unhideWhenUsed="1"/>
     <w:lsdException w:name="Smart Link" w:semiHidden="1" w:unhideWhenUsed="1"/>
   </w:latentStyles>
-  <w:style w:type="paragraph" w:styleId="Normal" w:default="1">
+  <w:style w:type="paragraph" w:default="1" w:styleId="Normal">
     <w:name w:val="Normal"/>
     <w:qFormat/>
   </w:style>
@@ -3769,7 +3949,7 @@
       <w:outlineLvl w:val="0"/>
     </w:pPr>
     <w:rPr>
-      <w:rFonts w:asciiTheme="majorHAnsi" w:hAnsiTheme="majorHAnsi" w:eastAsiaTheme="majorEastAsia" w:cstheme="majorBidi"/>
+      <w:rFonts w:asciiTheme="majorHAnsi" w:eastAsiaTheme="majorEastAsia" w:hAnsiTheme="majorHAnsi" w:cstheme="majorBidi"/>
       <w:color w:val="0F4761" w:themeColor="accent1" w:themeShade="BF"/>
       <w:sz w:val="40"/>
       <w:szCs w:val="40"/>
@@ -3791,7 +3971,7 @@
       <w:outlineLvl w:val="1"/>
     </w:pPr>
     <w:rPr>
-      <w:rFonts w:asciiTheme="majorHAnsi" w:hAnsiTheme="majorHAnsi" w:eastAsiaTheme="majorEastAsia" w:cstheme="majorBidi"/>
+      <w:rFonts w:asciiTheme="majorHAnsi" w:eastAsiaTheme="majorEastAsia" w:hAnsiTheme="majorHAnsi" w:cstheme="majorBidi"/>
       <w:b/>
       <w:color w:val="000000" w:themeColor="text1"/>
       <w:sz w:val="32"/>
@@ -3953,13 +4133,13 @@
       <w:color w:val="272727" w:themeColor="text1" w:themeTint="D8"/>
     </w:rPr>
   </w:style>
-  <w:style w:type="character" w:styleId="Policepardfaut" w:default="1">
+  <w:style w:type="character" w:default="1" w:styleId="Policepardfaut">
     <w:name w:val="Default Paragraph Font"/>
     <w:uiPriority w:val="1"/>
     <w:semiHidden/>
     <w:unhideWhenUsed/>
   </w:style>
-  <w:style w:type="table" w:styleId="TableauNormal" w:default="1">
+  <w:style w:type="table" w:default="1" w:styleId="TableauNormal">
     <w:name w:val="Normal Table"/>
     <w:uiPriority w:val="99"/>
     <w:semiHidden/>
@@ -3974,40 +4154,40 @@
       </w:tblCellMar>
     </w:tblPr>
   </w:style>
-  <w:style w:type="numbering" w:styleId="Aucuneliste" w:default="1">
+  <w:style w:type="numbering" w:default="1" w:styleId="Aucuneliste">
     <w:name w:val="No List"/>
     <w:uiPriority w:val="99"/>
     <w:semiHidden/>
     <w:unhideWhenUsed/>
   </w:style>
-  <w:style w:type="character" w:styleId="Titre1Car" w:customStyle="1">
+  <w:style w:type="character" w:customStyle="1" w:styleId="Titre1Car">
     <w:name w:val="Titre 1 Car"/>
     <w:basedOn w:val="Policepardfaut"/>
     <w:link w:val="Titre1"/>
     <w:uiPriority w:val="9"/>
     <w:rsid w:val="00964371"/>
     <w:rPr>
-      <w:rFonts w:asciiTheme="majorHAnsi" w:hAnsiTheme="majorHAnsi" w:eastAsiaTheme="majorEastAsia" w:cstheme="majorBidi"/>
+      <w:rFonts w:asciiTheme="majorHAnsi" w:eastAsiaTheme="majorEastAsia" w:hAnsiTheme="majorHAnsi" w:cstheme="majorBidi"/>
       <w:color w:val="0F4761" w:themeColor="accent1" w:themeShade="BF"/>
       <w:sz w:val="40"/>
       <w:szCs w:val="40"/>
     </w:rPr>
   </w:style>
-  <w:style w:type="character" w:styleId="Titre2Car" w:customStyle="1">
+  <w:style w:type="character" w:customStyle="1" w:styleId="Titre2Car">
     <w:name w:val="Titre 2 Car"/>
     <w:basedOn w:val="Policepardfaut"/>
     <w:link w:val="Titre2"/>
     <w:uiPriority w:val="9"/>
     <w:rsid w:val="001F65A2"/>
     <w:rPr>
-      <w:rFonts w:asciiTheme="majorHAnsi" w:hAnsiTheme="majorHAnsi" w:eastAsiaTheme="majorEastAsia" w:cstheme="majorBidi"/>
+      <w:rFonts w:asciiTheme="majorHAnsi" w:eastAsiaTheme="majorEastAsia" w:hAnsiTheme="majorHAnsi" w:cstheme="majorBidi"/>
       <w:b/>
       <w:color w:val="000000" w:themeColor="text1"/>
       <w:sz w:val="32"/>
       <w:szCs w:val="32"/>
     </w:rPr>
   </w:style>
-  <w:style w:type="character" w:styleId="Titre3Car" w:customStyle="1">
+  <w:style w:type="character" w:customStyle="1" w:styleId="Titre3Car">
     <w:name w:val="Titre 3 Car"/>
     <w:basedOn w:val="Policepardfaut"/>
     <w:link w:val="Titre3"/>
@@ -4021,7 +4201,7 @@
       <w:szCs w:val="28"/>
     </w:rPr>
   </w:style>
-  <w:style w:type="character" w:styleId="Titre4Car" w:customStyle="1">
+  <w:style w:type="character" w:customStyle="1" w:styleId="Titre4Car">
     <w:name w:val="Titre 4 Car"/>
     <w:basedOn w:val="Policepardfaut"/>
     <w:link w:val="Titre4"/>
@@ -4035,7 +4215,7 @@
       <w:color w:val="0F4761" w:themeColor="accent1" w:themeShade="BF"/>
     </w:rPr>
   </w:style>
-  <w:style w:type="character" w:styleId="Titre5Car" w:customStyle="1">
+  <w:style w:type="character" w:customStyle="1" w:styleId="Titre5Car">
     <w:name w:val="Titre 5 Car"/>
     <w:basedOn w:val="Policepardfaut"/>
     <w:link w:val="Titre5"/>
@@ -4047,7 +4227,7 @@
       <w:color w:val="0F4761" w:themeColor="accent1" w:themeShade="BF"/>
     </w:rPr>
   </w:style>
-  <w:style w:type="character" w:styleId="Titre6Car" w:customStyle="1">
+  <w:style w:type="character" w:customStyle="1" w:styleId="Titre6Car">
     <w:name w:val="Titre 6 Car"/>
     <w:basedOn w:val="Policepardfaut"/>
     <w:link w:val="Titre6"/>
@@ -4061,7 +4241,7 @@
       <w:color w:val="595959" w:themeColor="text1" w:themeTint="A6"/>
     </w:rPr>
   </w:style>
-  <w:style w:type="character" w:styleId="Titre7Car" w:customStyle="1">
+  <w:style w:type="character" w:customStyle="1" w:styleId="Titre7Car">
     <w:name w:val="Titre 7 Car"/>
     <w:basedOn w:val="Policepardfaut"/>
     <w:link w:val="Titre7"/>
@@ -4073,7 +4253,7 @@
       <w:color w:val="595959" w:themeColor="text1" w:themeTint="A6"/>
     </w:rPr>
   </w:style>
-  <w:style w:type="character" w:styleId="Titre8Car" w:customStyle="1">
+  <w:style w:type="character" w:customStyle="1" w:styleId="Titre8Car">
     <w:name w:val="Titre 8 Car"/>
     <w:basedOn w:val="Policepardfaut"/>
     <w:link w:val="Titre8"/>
@@ -4087,7 +4267,7 @@
       <w:color w:val="272727" w:themeColor="text1" w:themeTint="D8"/>
     </w:rPr>
   </w:style>
-  <w:style w:type="character" w:styleId="Titre9Car" w:customStyle="1">
+  <w:style w:type="character" w:customStyle="1" w:styleId="Titre9Car">
     <w:name w:val="Titre 9 Car"/>
     <w:basedOn w:val="Policepardfaut"/>
     <w:link w:val="Titre9"/>
@@ -4112,7 +4292,7 @@
       <w:contextualSpacing/>
     </w:pPr>
     <w:rPr>
-      <w:rFonts w:asciiTheme="majorHAnsi" w:hAnsiTheme="majorHAnsi" w:eastAsiaTheme="majorEastAsia" w:cstheme="majorBidi"/>
+      <w:rFonts w:asciiTheme="majorHAnsi" w:eastAsiaTheme="majorEastAsia" w:hAnsiTheme="majorHAnsi" w:cstheme="majorBidi"/>
       <w:b/>
       <w:spacing w:val="-10"/>
       <w:kern w:val="28"/>
@@ -4120,14 +4300,14 @@
       <w:szCs w:val="56"/>
     </w:rPr>
   </w:style>
-  <w:style w:type="character" w:styleId="TitreCar" w:customStyle="1">
+  <w:style w:type="character" w:customStyle="1" w:styleId="TitreCar">
     <w:name w:val="Titre Car"/>
     <w:basedOn w:val="Policepardfaut"/>
     <w:link w:val="Titre"/>
     <w:uiPriority w:val="10"/>
     <w:rsid w:val="001F65A2"/>
     <w:rPr>
-      <w:rFonts w:asciiTheme="majorHAnsi" w:hAnsiTheme="majorHAnsi" w:eastAsiaTheme="majorEastAsia" w:cstheme="majorBidi"/>
+      <w:rFonts w:asciiTheme="majorHAnsi" w:eastAsiaTheme="majorEastAsia" w:hAnsiTheme="majorHAnsi" w:cstheme="majorBidi"/>
       <w:b/>
       <w:spacing w:val="-10"/>
       <w:kern w:val="28"/>
@@ -4156,7 +4336,7 @@
       <w:szCs w:val="28"/>
     </w:rPr>
   </w:style>
-  <w:style w:type="character" w:styleId="Sous-titreCar" w:customStyle="1">
+  <w:style w:type="character" w:customStyle="1" w:styleId="Sous-titreCar">
     <w:name w:val="Sous-titre Car"/>
     <w:basedOn w:val="Policepardfaut"/>
     <w:link w:val="Sous-titre"/>
@@ -4188,7 +4368,7 @@
       <w:color w:val="404040" w:themeColor="text1" w:themeTint="BF"/>
     </w:rPr>
   </w:style>
-  <w:style w:type="character" w:styleId="CitationCar" w:customStyle="1">
+  <w:style w:type="character" w:customStyle="1" w:styleId="CitationCar">
     <w:name w:val="Citation Car"/>
     <w:basedOn w:val="Policepardfaut"/>
     <w:link w:val="Citation"/>
@@ -4233,8 +4413,8 @@
     <w:rsid w:val="00964371"/>
     <w:pPr>
       <w:pBdr>
-        <w:top w:val="single" w:color="0F4761" w:themeColor="accent1" w:themeShade="BF" w:sz="4" w:space="10"/>
-        <w:bottom w:val="single" w:color="0F4761" w:themeColor="accent1" w:themeShade="BF" w:sz="4" w:space="10"/>
+        <w:top w:val="single" w:sz="4" w:space="10" w:color="0F4761" w:themeColor="accent1" w:themeShade="BF"/>
+        <w:bottom w:val="single" w:sz="4" w:space="10" w:color="0F4761" w:themeColor="accent1" w:themeShade="BF"/>
       </w:pBdr>
       <w:spacing w:before="360" w:after="360"/>
       <w:ind w:left="864" w:right="864"/>
@@ -4246,7 +4426,7 @@
       <w:color w:val="0F4761" w:themeColor="accent1" w:themeShade="BF"/>
     </w:rPr>
   </w:style>
-  <w:style w:type="character" w:styleId="CitationintenseCar" w:customStyle="1">
+  <w:style w:type="character" w:customStyle="1" w:styleId="CitationintenseCar">
     <w:name w:val="Citation intense Car"/>
     <w:basedOn w:val="Policepardfaut"/>
     <w:link w:val="Citationintense"/>
@@ -4299,7 +4479,7 @@
       <w:szCs w:val="20"/>
     </w:rPr>
   </w:style>
-  <w:style w:type="character" w:styleId="CommentaireCar" w:customStyle="1">
+  <w:style w:type="character" w:customStyle="1" w:styleId="CommentaireCar">
     <w:name w:val="Commentaire Car"/>
     <w:basedOn w:val="Policepardfaut"/>
     <w:link w:val="Commentaire"/>
@@ -4324,7 +4504,7 @@
       <w:bCs/>
     </w:rPr>
   </w:style>
-  <w:style w:type="character" w:styleId="ObjetducommentaireCar" w:customStyle="1">
+  <w:style w:type="character" w:customStyle="1" w:styleId="ObjetducommentaireCar">
     <w:name w:val="Objet du commentaire Car"/>
     <w:basedOn w:val="CommentaireCar"/>
     <w:link w:val="Objetducommentaire"/>
@@ -4338,12 +4518,12 @@
       <w:szCs w:val="20"/>
     </w:rPr>
   </w:style>
-  <w:style w:type="character" w:styleId="normaltextrun" w:customStyle="1">
+  <w:style w:type="character" w:customStyle="1" w:styleId="normaltextrun">
     <w:name w:val="normaltextrun"/>
     <w:basedOn w:val="Policepardfaut"/>
     <w:rsid w:val="756A3806"/>
     <w:rPr>
-      <w:rFonts w:asciiTheme="minorHAnsi" w:hAnsiTheme="minorHAnsi" w:eastAsiaTheme="minorEastAsia" w:cstheme="minorBidi"/>
+      <w:rFonts w:asciiTheme="minorHAnsi" w:eastAsiaTheme="minorEastAsia" w:hAnsiTheme="minorHAnsi" w:cstheme="minorBidi"/>
       <w:sz w:val="22"/>
       <w:szCs w:val="22"/>
     </w:rPr>
@@ -4386,12 +4566,12 @@
     </w:pPr>
     <w:tblPr>
       <w:tblBorders>
-        <w:top w:val="single" w:color="000000" w:themeColor="text1" w:sz="4" w:space="0"/>
-        <w:left w:val="single" w:color="000000" w:themeColor="text1" w:sz="4" w:space="0"/>
-        <w:bottom w:val="single" w:color="000000" w:themeColor="text1" w:sz="4" w:space="0"/>
-        <w:right w:val="single" w:color="000000" w:themeColor="text1" w:sz="4" w:space="0"/>
-        <w:insideH w:val="single" w:color="000000" w:themeColor="text1" w:sz="4" w:space="0"/>
-        <w:insideV w:val="single" w:color="000000" w:themeColor="text1" w:sz="4" w:space="0"/>
+        <w:top w:val="single" w:sz="4" w:space="0" w:color="000000" w:themeColor="text1"/>
+        <w:left w:val="single" w:sz="4" w:space="0" w:color="000000" w:themeColor="text1"/>
+        <w:bottom w:val="single" w:sz="4" w:space="0" w:color="000000" w:themeColor="text1"/>
+        <w:right w:val="single" w:sz="4" w:space="0" w:color="000000" w:themeColor="text1"/>
+        <w:insideH w:val="single" w:sz="4" w:space="0" w:color="000000" w:themeColor="text1"/>
+        <w:insideV w:val="single" w:sz="4" w:space="0" w:color="000000" w:themeColor="text1"/>
       </w:tblBorders>
     </w:tblPr>
   </w:style>
@@ -4409,7 +4589,7 @@
 </file>
 
 <file path=word/theme/theme1.xml><?xml version="1.0" encoding="utf-8"?>
-<a:theme xmlns:a="http://schemas.openxmlformats.org/drawingml/2006/main" xmlns:thm15="http://schemas.microsoft.com/office/thememl/2012/main" name="Thème Office">
+<a:theme xmlns:a="http://schemas.openxmlformats.org/drawingml/2006/main" name="Thème Office">
   <a:themeElements>
     <a:clrScheme name="Office">
       <a:dk1>

</xml_diff>